<commit_message>
Fix multiline regex for figure dimensions and remove hardcoded sizes
</commit_message>
<xml_diff>
--- a/docs/manuscript.docx
+++ b/docs/manuscript.docx
@@ -3020,7 +3020,7 @@
       <w:r>
         <w:drawing>
           <wp:inline>
-            <wp:extent cx="5334000" cy="3093597"/>
+            <wp:extent cx="5334000" cy="6866758"/>
             <wp:effectExtent b="0" l="0" r="0" t="0"/>
             <wp:docPr descr="Clinical Attention Framework (CAF) Architecture Diagram. The schematic shows how patient context features (x_{gate}) pass through a linear gating layer to generate modality logits. A Softmax function converts these logits to dynamic routing probabilities (P_{tab}, P_{soft}, P_{hard}) that scale aligned modality scores (s_{tab}, s_{soft}, s_{hard}). The final diagnostic prediction logit is scaled and shifted before being passed to a Sigmoid function." title="" id="27" name="Picture"/>
             <a:graphic>
@@ -3041,7 +3041,7 @@
                   <pic:spPr bwMode="auto">
                     <a:xfrm>
                       <a:off x="0" y="0"/>
-                      <a:ext cx="5334000" cy="3093597"/>
+                      <a:ext cx="5334000" cy="6866758"/>
                     </a:xfrm>
                     <a:prstGeom prst="rect">
                       <a:avLst/>
@@ -15425,7 +15425,7 @@
       <w:r>
         <w:drawing>
           <wp:inline>
-            <wp:extent cx="5334000" cy="4000498"/>
+            <wp:extent cx="5334000" cy="4000499"/>
             <wp:effectExtent b="0" l="0" r="0" t="0"/>
             <wp:docPr descr="Dose-Response Attention Routing vs. Nicotine Exposure. Scatter plot showing the correlation between patient nicotine exposure intensity and the soft-tissue photo attention weight (P_{soft}). Active vapers (red triangles) show a clear suppression of visual trust as exposure increases, while non-vapers (blue circles) maintain high visual trust." title="" id="70" name="Picture"/>
             <a:graphic>
@@ -15446,7 +15446,7 @@
                   <pic:spPr bwMode="auto">
                     <a:xfrm>
                       <a:off x="0" y="0"/>
-                      <a:ext cx="5334000" cy="4000498"/>
+                      <a:ext cx="5334000" cy="4000499"/>
                     </a:xfrm>
                     <a:prstGeom prst="rect">
                       <a:avLst/>

</xml_diff>

<commit_message>
Fix table corruption by removing old simple table leftovers
</commit_message>
<xml_diff>
--- a/docs/manuscript.docx
+++ b/docs/manuscript.docx
@@ -8979,831 +8979,6 @@
         </w:tc>
       </w:tr>
     </w:tbl>
-    <w:p>
-      <w:pPr>
-        <w:pStyle w:val="BodyText"/>
-      </w:pPr>
-      <w:r>
-        <w:t xml:space="preserve">Model Name Accuracy Precision Recall F1-Score ROC-AUC</w:t>
-      </w:r>
-      <w:r>
-        <w:t xml:space="preserve"> </w:t>
-      </w:r>
-      <w:r>
-        <w:t xml:space="preserve">(Sensitivity)</w:t>
-      </w:r>
-      <w:r>
-        <w:br/>
-      </w:r>
-      <w:r>
-        <w:t xml:space="preserve">———————— ———— ———— ————— ———— ————</w:t>
-      </w:r>
-      <w:r>
-        <w:t xml:space="preserve"> </w:t>
-      </w:r>
-      <w:r>
-        <w:rPr>
-          <w:b/>
-          <w:bCs/>
-        </w:rPr>
-        <w:t xml:space="preserve">Baseline 65.2%</w:t>
-      </w:r>
-      <w:r>
-        <w:rPr>
-          <w:b/>
-          <w:bCs/>
-        </w:rPr>
-        <w:t xml:space="preserve"> </w:t>
-      </w:r>
-      <m:oMath>
-        <m:r>
-          <m:rPr>
-            <m:sty m:val="p"/>
-          </m:rPr>
-          <m:t>±</m:t>
-        </m:r>
-      </m:oMath>
-      <w:r>
-        <w:rPr>
-          <w:b/>
-          <w:bCs/>
-        </w:rPr>
-        <w:t xml:space="preserve"> </w:t>
-      </w:r>
-      <w:r>
-        <w:rPr>
-          <w:b/>
-          <w:bCs/>
-        </w:rPr>
-        <w:t xml:space="preserve">0.0% 64.0%</w:t>
-      </w:r>
-      <w:r>
-        <w:rPr>
-          <w:b/>
-          <w:bCs/>
-        </w:rPr>
-        <w:t xml:space="preserve"> </w:t>
-      </w:r>
-      <m:oMath>
-        <m:r>
-          <m:rPr>
-            <m:sty m:val="p"/>
-          </m:rPr>
-          <m:t>±</m:t>
-        </m:r>
-      </m:oMath>
-      <w:r>
-        <w:rPr>
-          <w:b/>
-          <w:bCs/>
-        </w:rPr>
-        <w:t xml:space="preserve"> </w:t>
-      </w:r>
-      <w:r>
-        <w:rPr>
-          <w:b/>
-          <w:bCs/>
-        </w:rPr>
-        <w:t xml:space="preserve">0.0% 69.6%</w:t>
-      </w:r>
-      <w:r>
-        <w:rPr>
-          <w:b/>
-          <w:bCs/>
-        </w:rPr>
-        <w:t xml:space="preserve"> </w:t>
-      </w:r>
-      <m:oMath>
-        <m:r>
-          <m:rPr>
-            <m:sty m:val="p"/>
-          </m:rPr>
-          <m:t>±</m:t>
-        </m:r>
-      </m:oMath>
-      <w:r>
-        <w:rPr>
-          <w:b/>
-          <w:bCs/>
-        </w:rPr>
-        <w:t xml:space="preserve"> </w:t>
-      </w:r>
-      <w:r>
-        <w:rPr>
-          <w:b/>
-          <w:bCs/>
-        </w:rPr>
-        <w:t xml:space="preserve">0.0% 0.667</w:t>
-      </w:r>
-      <w:r>
-        <w:rPr>
-          <w:b/>
-          <w:bCs/>
-        </w:rPr>
-        <w:t xml:space="preserve"> </w:t>
-      </w:r>
-      <m:oMath>
-        <m:r>
-          <m:rPr>
-            <m:sty m:val="p"/>
-          </m:rPr>
-          <m:t>±</m:t>
-        </m:r>
-      </m:oMath>
-      <w:r>
-        <w:rPr>
-          <w:b/>
-          <w:bCs/>
-        </w:rPr>
-        <w:t xml:space="preserve"> </w:t>
-      </w:r>
-      <w:r>
-        <w:rPr>
-          <w:b/>
-          <w:bCs/>
-        </w:rPr>
-        <w:t xml:space="preserve">0.684</w:t>
-      </w:r>
-      <w:r>
-        <w:rPr>
-          <w:b/>
-          <w:bCs/>
-        </w:rPr>
-        <w:t xml:space="preserve"> </w:t>
-      </w:r>
-      <m:oMath>
-        <m:r>
-          <m:rPr>
-            <m:sty m:val="p"/>
-          </m:rPr>
-          <m:t>±</m:t>
-        </m:r>
-      </m:oMath>
-      <w:r>
-        <w:rPr>
-          <w:b/>
-          <w:bCs/>
-        </w:rPr>
-        <w:t xml:space="preserve"> </w:t>
-      </w:r>
-      <w:r>
-        <w:rPr>
-          <w:b/>
-          <w:bCs/>
-        </w:rPr>
-        <w:t xml:space="preserve">(Questionnaire-Only)</w:t>
-      </w:r>
-      <w:r>
-        <w:t xml:space="preserve"> </w:t>
-      </w:r>
-      <w:r>
-        <w:t xml:space="preserve">0.000 0.000</w:t>
-      </w:r>
-    </w:p>
-    <w:p>
-      <w:pPr>
-        <w:pStyle w:val="BodyText"/>
-      </w:pPr>
-      <w:r>
-        <w:rPr>
-          <w:b/>
-          <w:bCs/>
-        </w:rPr>
-        <w:t xml:space="preserve">Late Concatenation 60.9%</w:t>
-      </w:r>
-      <w:r>
-        <w:rPr>
-          <w:b/>
-          <w:bCs/>
-        </w:rPr>
-        <w:t xml:space="preserve"> </w:t>
-      </w:r>
-      <m:oMath>
-        <m:r>
-          <m:rPr>
-            <m:sty m:val="p"/>
-          </m:rPr>
-          <m:t>±</m:t>
-        </m:r>
-      </m:oMath>
-      <w:r>
-        <w:rPr>
-          <w:b/>
-          <w:bCs/>
-        </w:rPr>
-        <w:t xml:space="preserve"> </w:t>
-      </w:r>
-      <w:r>
-        <w:rPr>
-          <w:b/>
-          <w:bCs/>
-        </w:rPr>
-        <w:t xml:space="preserve">0.0% 59.3%</w:t>
-      </w:r>
-      <w:r>
-        <w:rPr>
-          <w:b/>
-          <w:bCs/>
-        </w:rPr>
-        <w:t xml:space="preserve"> </w:t>
-      </w:r>
-      <m:oMath>
-        <m:r>
-          <m:rPr>
-            <m:sty m:val="p"/>
-          </m:rPr>
-          <m:t>±</m:t>
-        </m:r>
-      </m:oMath>
-      <w:r>
-        <w:rPr>
-          <w:b/>
-          <w:bCs/>
-        </w:rPr>
-        <w:t xml:space="preserve"> </w:t>
-      </w:r>
-      <w:r>
-        <w:rPr>
-          <w:b/>
-          <w:bCs/>
-        </w:rPr>
-        <w:t xml:space="preserve">0.0% 69.6%</w:t>
-      </w:r>
-      <w:r>
-        <w:rPr>
-          <w:b/>
-          <w:bCs/>
-        </w:rPr>
-        <w:t xml:space="preserve"> </w:t>
-      </w:r>
-      <m:oMath>
-        <m:r>
-          <m:rPr>
-            <m:sty m:val="p"/>
-          </m:rPr>
-          <m:t>±</m:t>
-        </m:r>
-      </m:oMath>
-      <w:r>
-        <w:rPr>
-          <w:b/>
-          <w:bCs/>
-        </w:rPr>
-        <w:t xml:space="preserve"> </w:t>
-      </w:r>
-      <w:r>
-        <w:rPr>
-          <w:b/>
-          <w:bCs/>
-        </w:rPr>
-        <w:t xml:space="preserve">0.0% 0.640</w:t>
-      </w:r>
-      <w:r>
-        <w:rPr>
-          <w:b/>
-          <w:bCs/>
-        </w:rPr>
-        <w:t xml:space="preserve"> </w:t>
-      </w:r>
-      <m:oMath>
-        <m:r>
-          <m:rPr>
-            <m:sty m:val="p"/>
-          </m:rPr>
-          <m:t>±</m:t>
-        </m:r>
-      </m:oMath>
-      <w:r>
-        <w:rPr>
-          <w:b/>
-          <w:bCs/>
-        </w:rPr>
-        <w:t xml:space="preserve"> </w:t>
-      </w:r>
-      <w:r>
-        <w:rPr>
-          <w:b/>
-          <w:bCs/>
-        </w:rPr>
-        <w:t xml:space="preserve">0.671</w:t>
-      </w:r>
-      <w:r>
-        <w:rPr>
-          <w:b/>
-          <w:bCs/>
-        </w:rPr>
-        <w:t xml:space="preserve"> </w:t>
-      </w:r>
-      <m:oMath>
-        <m:r>
-          <m:rPr>
-            <m:sty m:val="p"/>
-          </m:rPr>
-          <m:t>±</m:t>
-        </m:r>
-      </m:oMath>
-      <w:r>
-        <w:rPr>
-          <w:b/>
-          <w:bCs/>
-        </w:rPr>
-        <w:t xml:space="preserve"> </w:t>
-      </w:r>
-      <w:r>
-        <w:rPr>
-          <w:b/>
-          <w:bCs/>
-        </w:rPr>
-        <w:t xml:space="preserve">Fusion</w:t>
-      </w:r>
-      <w:r>
-        <w:t xml:space="preserve"> </w:t>
-      </w:r>
-      <w:r>
-        <w:t xml:space="preserve">0.000 0.000</w:t>
-      </w:r>
-    </w:p>
-    <w:p>
-      <w:pPr>
-        <w:pStyle w:val="BodyText"/>
-      </w:pPr>
-      <w:r>
-        <w:rPr>
-          <w:b/>
-          <w:bCs/>
-        </w:rPr>
-        <w:t xml:space="preserve">Gated Multimodal Unit 62.0%</w:t>
-      </w:r>
-      <w:r>
-        <w:rPr>
-          <w:b/>
-          <w:bCs/>
-        </w:rPr>
-        <w:t xml:space="preserve"> </w:t>
-      </w:r>
-      <m:oMath>
-        <m:r>
-          <m:rPr>
-            <m:sty m:val="p"/>
-          </m:rPr>
-          <m:t>±</m:t>
-        </m:r>
-      </m:oMath>
-      <w:r>
-        <w:rPr>
-          <w:b/>
-          <w:bCs/>
-        </w:rPr>
-        <w:t xml:space="preserve"> </w:t>
-      </w:r>
-      <w:r>
-        <w:rPr>
-          <w:b/>
-          <w:bCs/>
-        </w:rPr>
-        <w:t xml:space="preserve">3.3% 60.4%</w:t>
-      </w:r>
-      <w:r>
-        <w:rPr>
-          <w:b/>
-          <w:bCs/>
-        </w:rPr>
-        <w:t xml:space="preserve"> </w:t>
-      </w:r>
-      <m:oMath>
-        <m:r>
-          <m:rPr>
-            <m:sty m:val="p"/>
-          </m:rPr>
-          <m:t>±</m:t>
-        </m:r>
-      </m:oMath>
-      <w:r>
-        <w:rPr>
-          <w:b/>
-          <w:bCs/>
-        </w:rPr>
-        <w:t xml:space="preserve"> </w:t>
-      </w:r>
-      <w:r>
-        <w:rPr>
-          <w:b/>
-          <w:bCs/>
-        </w:rPr>
-        <w:t xml:space="preserve">3.0% 70.4%</w:t>
-      </w:r>
-      <w:r>
-        <w:rPr>
-          <w:b/>
-          <w:bCs/>
-        </w:rPr>
-        <w:t xml:space="preserve"> </w:t>
-      </w:r>
-      <m:oMath>
-        <m:r>
-          <m:rPr>
-            <m:sty m:val="p"/>
-          </m:rPr>
-          <m:t>±</m:t>
-        </m:r>
-      </m:oMath>
-      <w:r>
-        <w:rPr>
-          <w:b/>
-          <w:bCs/>
-        </w:rPr>
-        <w:t xml:space="preserve"> </w:t>
-      </w:r>
-      <w:r>
-        <w:rPr>
-          <w:b/>
-          <w:bCs/>
-        </w:rPr>
-        <w:t xml:space="preserve">5.0% 0.649</w:t>
-      </w:r>
-      <w:r>
-        <w:rPr>
-          <w:b/>
-          <w:bCs/>
-        </w:rPr>
-        <w:t xml:space="preserve"> </w:t>
-      </w:r>
-      <m:oMath>
-        <m:r>
-          <m:rPr>
-            <m:sty m:val="p"/>
-          </m:rPr>
-          <m:t>±</m:t>
-        </m:r>
-      </m:oMath>
-      <w:r>
-        <w:rPr>
-          <w:b/>
-          <w:bCs/>
-        </w:rPr>
-        <w:t xml:space="preserve"> </w:t>
-      </w:r>
-      <w:r>
-        <w:rPr>
-          <w:b/>
-          <w:bCs/>
-        </w:rPr>
-        <w:t xml:space="preserve">0.654</w:t>
-      </w:r>
-      <w:r>
-        <w:rPr>
-          <w:b/>
-          <w:bCs/>
-        </w:rPr>
-        <w:t xml:space="preserve"> </w:t>
-      </w:r>
-      <m:oMath>
-        <m:r>
-          <m:rPr>
-            <m:sty m:val="p"/>
-          </m:rPr>
-          <m:t>±</m:t>
-        </m:r>
-      </m:oMath>
-      <w:r>
-        <w:rPr>
-          <w:b/>
-          <w:bCs/>
-        </w:rPr>
-        <w:t xml:space="preserve"> </w:t>
-      </w:r>
-      <w:r>
-        <w:rPr>
-          <w:b/>
-          <w:bCs/>
-        </w:rPr>
-        <w:t xml:space="preserve">(GMU)</w:t>
-      </w:r>
-      <w:r>
-        <w:t xml:space="preserve"> </w:t>
-      </w:r>
-      <w:r>
-        <w:t xml:space="preserve">0.033 0.032</w:t>
-      </w:r>
-    </w:p>
-    <w:p>
-      <w:pPr>
-        <w:pStyle w:val="BodyText"/>
-      </w:pPr>
-      <w:r>
-        <w:rPr>
-          <w:b/>
-          <w:bCs/>
-        </w:rPr>
-        <w:t xml:space="preserve">Bilinear Tensor 63.0%</w:t>
-      </w:r>
-      <w:r>
-        <w:rPr>
-          <w:b/>
-          <w:bCs/>
-        </w:rPr>
-        <w:t xml:space="preserve"> </w:t>
-      </w:r>
-      <m:oMath>
-        <m:r>
-          <m:rPr>
-            <m:sty m:val="p"/>
-          </m:rPr>
-          <m:t>±</m:t>
-        </m:r>
-      </m:oMath>
-      <w:r>
-        <w:rPr>
-          <w:b/>
-          <w:bCs/>
-        </w:rPr>
-        <w:t xml:space="preserve"> </w:t>
-      </w:r>
-      <w:r>
-        <w:rPr>
-          <w:b/>
-          <w:bCs/>
-        </w:rPr>
-        <w:t xml:space="preserve">0.0% 60.7%</w:t>
-      </w:r>
-      <w:r>
-        <w:rPr>
-          <w:b/>
-          <w:bCs/>
-        </w:rPr>
-        <w:t xml:space="preserve"> </w:t>
-      </w:r>
-      <m:oMath>
-        <m:r>
-          <m:rPr>
-            <m:sty m:val="p"/>
-          </m:rPr>
-          <m:t>±</m:t>
-        </m:r>
-      </m:oMath>
-      <w:r>
-        <w:rPr>
-          <w:b/>
-          <w:bCs/>
-        </w:rPr>
-        <w:t xml:space="preserve"> </w:t>
-      </w:r>
-      <w:r>
-        <w:rPr>
-          <w:b/>
-          <w:bCs/>
-        </w:rPr>
-        <w:t xml:space="preserve">0.0% 73.9%</w:t>
-      </w:r>
-      <w:r>
-        <w:rPr>
-          <w:b/>
-          <w:bCs/>
-        </w:rPr>
-        <w:t xml:space="preserve"> </w:t>
-      </w:r>
-      <m:oMath>
-        <m:r>
-          <m:rPr>
-            <m:sty m:val="p"/>
-          </m:rPr>
-          <m:t>±</m:t>
-        </m:r>
-      </m:oMath>
-      <w:r>
-        <w:rPr>
-          <w:b/>
-          <w:bCs/>
-        </w:rPr>
-        <w:t xml:space="preserve"> </w:t>
-      </w:r>
-      <w:r>
-        <w:rPr>
-          <w:b/>
-          <w:bCs/>
-        </w:rPr>
-        <w:t xml:space="preserve">0.0% 0.667</w:t>
-      </w:r>
-      <w:r>
-        <w:rPr>
-          <w:b/>
-          <w:bCs/>
-        </w:rPr>
-        <w:t xml:space="preserve"> </w:t>
-      </w:r>
-      <m:oMath>
-        <m:r>
-          <m:rPr>
-            <m:sty m:val="p"/>
-          </m:rPr>
-          <m:t>±</m:t>
-        </m:r>
-      </m:oMath>
-      <w:r>
-        <w:rPr>
-          <w:b/>
-          <w:bCs/>
-        </w:rPr>
-        <w:t xml:space="preserve"> </w:t>
-      </w:r>
-      <w:r>
-        <w:rPr>
-          <w:b/>
-          <w:bCs/>
-        </w:rPr>
-        <w:t xml:space="preserve">0.675</w:t>
-      </w:r>
-      <w:r>
-        <w:rPr>
-          <w:b/>
-          <w:bCs/>
-        </w:rPr>
-        <w:t xml:space="preserve"> </w:t>
-      </w:r>
-      <m:oMath>
-        <m:r>
-          <m:rPr>
-            <m:sty m:val="p"/>
-          </m:rPr>
-          <m:t>±</m:t>
-        </m:r>
-      </m:oMath>
-      <w:r>
-        <w:rPr>
-          <w:b/>
-          <w:bCs/>
-        </w:rPr>
-        <w:t xml:space="preserve"> </w:t>
-      </w:r>
-      <w:r>
-        <w:rPr>
-          <w:b/>
-          <w:bCs/>
-        </w:rPr>
-        <w:t xml:space="preserve">Fusion</w:t>
-      </w:r>
-      <w:r>
-        <w:t xml:space="preserve"> </w:t>
-      </w:r>
-      <w:r>
-        <w:t xml:space="preserve">0.000 0.000</w:t>
-      </w:r>
-    </w:p>
-    <w:p>
-      <w:pPr>
-        <w:pStyle w:val="BodyText"/>
-      </w:pPr>
-      <w:r>
-        <w:rPr>
-          <w:b/>
-          <w:bCs/>
-        </w:rPr>
-        <w:t xml:space="preserve">CAF Gating Pipeline</w:t>
-      </w:r>
-      <w:r>
-        <w:t xml:space="preserve"> </w:t>
-      </w:r>
-      <w:r>
-        <w:rPr>
-          <w:b/>
-          <w:bCs/>
-        </w:rPr>
-        <w:t xml:space="preserve">68.59%</w:t>
-      </w:r>
-      <w:r>
-        <w:rPr>
-          <w:b/>
-          <w:bCs/>
-        </w:rPr>
-        <w:t xml:space="preserve"> </w:t>
-      </w:r>
-      <m:oMath>
-        <m:r>
-          <m:rPr>
-            <m:sty m:val="p"/>
-          </m:rPr>
-          <m:t>±</m:t>
-        </m:r>
-      </m:oMath>
-      <w:r>
-        <w:rPr>
-          <w:b/>
-          <w:bCs/>
-        </w:rPr>
-        <w:t xml:space="preserve"> </w:t>
-      </w:r>
-      <w:r>
-        <w:t xml:space="preserve">67.23%</w:t>
-      </w:r>
-      <w:r>
-        <w:t xml:space="preserve"> </w:t>
-      </w:r>
-      <m:oMath>
-        <m:r>
-          <m:rPr>
-            <m:sty m:val="p"/>
-          </m:rPr>
-          <m:t>±</m:t>
-        </m:r>
-      </m:oMath>
-      <w:r>
-        <w:t xml:space="preserve"> </w:t>
-      </w:r>
-      <w:r>
-        <w:rPr>
-          <w:b/>
-          <w:bCs/>
-        </w:rPr>
-        <w:t xml:space="preserve">72.52%</w:t>
-      </w:r>
-      <w:r>
-        <w:rPr>
-          <w:b/>
-          <w:bCs/>
-        </w:rPr>
-        <w:t xml:space="preserve"> </w:t>
-      </w:r>
-      <m:oMath>
-        <m:r>
-          <m:rPr>
-            <m:sty m:val="p"/>
-          </m:rPr>
-          <m:t>±</m:t>
-        </m:r>
-      </m:oMath>
-      <w:r>
-        <w:rPr>
-          <w:b/>
-          <w:bCs/>
-        </w:rPr>
-        <w:t xml:space="preserve"> </w:t>
-      </w:r>
-      <w:r>
-        <w:t xml:space="preserve">0.698</w:t>
-      </w:r>
-      <w:r>
-        <w:t xml:space="preserve"> </w:t>
-      </w:r>
-      <m:oMath>
-        <m:r>
-          <m:rPr>
-            <m:sty m:val="p"/>
-          </m:rPr>
-          <m:t>±</m:t>
-        </m:r>
-      </m:oMath>
-      <w:r>
-        <w:t xml:space="preserve"> </w:t>
-      </w:r>
-      <w:r>
-        <w:rPr>
-          <w:b/>
-          <w:bCs/>
-        </w:rPr>
-        <w:t xml:space="preserve">0.7013</w:t>
-      </w:r>
-      <w:r>
-        <w:rPr>
-          <w:b/>
-          <w:bCs/>
-        </w:rPr>
-        <w:t xml:space="preserve"> </w:t>
-      </w:r>
-      <m:oMath>
-        <m:r>
-          <m:rPr>
-            <m:sty m:val="p"/>
-          </m:rPr>
-          <m:t>±</m:t>
-        </m:r>
-      </m:oMath>
-      <w:r>
-        <w:rPr>
-          <w:b/>
-          <w:bCs/>
-        </w:rPr>
-        <w:t xml:space="preserve"> </w:t>
-      </w:r>
-      <w:r>
-        <w:rPr>
-          <w:b/>
-          <w:bCs/>
-        </w:rPr>
-        <w:t xml:space="preserve">1.52%</w:t>
-      </w:r>
-      <w:r>
-        <w:t xml:space="preserve"> </w:t>
-      </w:r>
-      <w:r>
-        <w:t xml:space="preserve">1.27%** 2.53%** 0.017** 0.0227**</w:t>
-      </w:r>
-      <w:r>
-        <w:t xml:space="preserve"> </w:t>
-      </w:r>
-      <w:r>
-        <w:t xml:space="preserve">——————————————————————————————–</w:t>
-      </w:r>
-    </w:p>
     <w:p>
       <w:pPr>
         <w:pStyle w:val="CaptionedFigure"/>

</xml_diff>

<commit_message>
Shorten table headers and row labels to prevent LaTeX column overlap
</commit_message>
<xml_diff>
--- a/docs/manuscript.docx
+++ b/docs/manuscript.docx
@@ -8104,7 +8104,7 @@
               <w:jc w:val="center"/>
             </w:pPr>
             <w:r>
-              <w:t xml:space="preserve">Recall (Sensitivity)</w:t>
+              <w:t xml:space="preserve">Recall (Sens.)</w:t>
             </w:r>
           </w:p>
         </w:tc>
@@ -8146,7 +8146,7 @@
                 <w:b/>
                 <w:bCs/>
               </w:rPr>
-              <w:t xml:space="preserve">Baseline (Questionnaire-Only)</w:t>
+              <w:t xml:space="preserve">Questionnaire Baseline</w:t>
             </w:r>
           </w:p>
         </w:tc>
@@ -9319,7 +9319,7 @@
               <w:jc w:val="center"/>
             </w:pPr>
             <w:r>
-              <w:t xml:space="preserve">Recall (Sensitivity)</w:t>
+              <w:t xml:space="preserve">Recall (Sens.)</w:t>
             </w:r>
           </w:p>
         </w:tc>
@@ -9361,7 +9361,7 @@
                 <w:b/>
                 <w:bCs/>
               </w:rPr>
-              <w:t xml:space="preserve">Late Concatenation (Ensembled)</w:t>
+              <w:t xml:space="preserve">Late Concatenation (Ensemble)</w:t>
             </w:r>
           </w:p>
         </w:tc>

</xml_diff>

<commit_message>
Fix incorrect paragraph heading hashes and restore section 2.2.1/2.2.2 heading levels
</commit_message>
<xml_diff>
--- a/docs/manuscript.docx
+++ b/docs/manuscript.docx
@@ -2,7 +2,7 @@
 <file path=word/document.xml><?xml version="1.0" encoding="utf-8"?>
 <w:document xmlns:w="http://schemas.openxmlformats.org/wordprocessingml/2006/main" xmlns:m="http://schemas.openxmlformats.org/officeDocument/2006/math" xmlns:r="http://schemas.openxmlformats.org/officeDocument/2006/relationships" xmlns:o="urn:schemas-microsoft-com:office:office" xmlns:v="urn:schemas-microsoft-com:vml" xmlns:w10="urn:schemas-microsoft-com:office:word" xmlns:a="http://schemas.openxmlformats.org/drawingml/2006/main" xmlns:pic="http://schemas.openxmlformats.org/drawingml/2006/picture" xmlns:wp="http://schemas.openxmlformats.org/drawingml/2006/wordprocessingDrawing">
   <w:body>
-    <w:bookmarkStart w:id="108" w:name="Xc6dd00742e5f8d0e78b123b0cc7112025b2d239"/>
+    <w:bookmarkStart w:id="104" w:name="Xc6dd00742e5f8d0e78b123b0cc7112025b2d239"/>
     <w:p>
       <w:pPr>
         <w:pStyle w:val="Heading1"/>
@@ -1173,7 +1173,7 @@
       </w:r>
     </w:p>
     <w:bookmarkEnd w:id="12"/>
-    <w:bookmarkStart w:id="43" w:name="materials-and-methods"/>
+    <w:bookmarkStart w:id="39" w:name="materials-and-methods"/>
     <w:p>
       <w:pPr>
         <w:pStyle w:val="Heading2"/>
@@ -1186,7 +1186,7 @@
         <w:t xml:space="preserve">2. Materials and Methods</w:t>
       </w:r>
     </w:p>
-    <w:bookmarkStart w:id="16" w:name="patient-cohort-and-clinical-protocol"/>
+    <w:bookmarkStart w:id="15" w:name="patient-cohort-and-clinical-protocol"/>
     <w:p>
       <w:pPr>
         <w:pStyle w:val="Heading3"/>
@@ -1212,11 +1212,9 @@
         <w:t xml:space="preserve">2.1.1 Participant Selection and Inclusion Criteria</w:t>
       </w:r>
     </w:p>
-    <w:bookmarkEnd w:id="13"/>
-    <w:bookmarkStart w:id="14" w:name="X3c3614ab0ccda0b501f4d258fb02a6d412b4553"/>
-    <w:p>
-      <w:pPr>
-        <w:pStyle w:val="Heading4"/>
+    <w:p>
+      <w:pPr>
+        <w:pStyle w:val="FirstParagraph"/>
       </w:pPr>
       <w:r>
         <w:t xml:space="preserve">This single-center, cross-sectional observational pilot study was conducted at the European University Dental Clinic in Tbilisi, Georgia, from September 2025 to March 2026. The study protocol was formally approved by the Institutional Review Board (IRB) of European University, executed in strict compliance with the Declaration of Helsinki (</w:t>
@@ -1248,8 +1246,8 @@
         <w:t xml:space="preserve">3 mm and an absolute absence of radiographic bone loss (Papapanou et al., 2018). This structured cohort provided the core matrix for subsequent computational modeling and dynamic attention routing verification.</w:t>
       </w:r>
     </w:p>
-    <w:bookmarkEnd w:id="14"/>
-    <w:bookmarkStart w:id="15" w:name="multimodal-data-acquisition-protocol"/>
+    <w:bookmarkEnd w:id="13"/>
+    <w:bookmarkStart w:id="14" w:name="multimodal-data-acquisition-protocol"/>
     <w:p>
       <w:pPr>
         <w:pStyle w:val="Heading4"/>
@@ -1262,59 +1260,188 @@
         <w:t xml:space="preserve">2.1.2 Multimodal Data Acquisition Protocol</w:t>
       </w:r>
     </w:p>
+    <w:p>
+      <w:pPr>
+        <w:pStyle w:val="FirstParagraph"/>
+      </w:pPr>
+      <w:r>
+        <w:t xml:space="preserve">All three modalities were acquired during a single standardized clinical visit by a single calibrated examiner (M.N.) to minimize inter-operator variability.</w:t>
+      </w:r>
+    </w:p>
+    <w:p>
+      <w:pPr>
+        <w:numPr>
+          <w:ilvl w:val="0"/>
+          <w:numId w:val="1001"/>
+        </w:numPr>
+      </w:pPr>
+      <w:r>
+        <w:rPr>
+          <w:b/>
+          <w:bCs/>
+        </w:rPr>
+        <w:t xml:space="preserve">Soft-Tissue Modality (</w:t>
+      </w:r>
+      <m:oMath>
+        <m:sSub>
+          <m:e>
+            <m:r>
+              <m:t>P</m:t>
+            </m:r>
+          </m:e>
+          <m:sub>
+            <m:r>
+              <m:t>s</m:t>
+            </m:r>
+            <m:r>
+              <m:t>o</m:t>
+            </m:r>
+            <m:r>
+              <m:t>f</m:t>
+            </m:r>
+            <m:r>
+              <m:t>t</m:t>
+            </m:r>
+          </m:sub>
+        </m:sSub>
+      </m:oMath>
+      <w:r>
+        <w:rPr>
+          <w:b/>
+          <w:bCs/>
+        </w:rPr>
+        <w:t xml:space="preserve">):</w:t>
+      </w:r>
+      <w:r>
+        <w:t xml:space="preserve"> </w:t>
+      </w:r>
+      <w:r>
+        <w:t xml:space="preserve">Intraoral clinical photography was performed using a Canon EOS 4000D equipped with a 100mm macro lens and twin flash system, calibrated to approximately 5500K color temperature. A standardized exposure protocol was applied across all patients (f/22, 1/200s, ISO 100) to ensure consistent color rendition and depth of field. Bilateral cheek retractors were used for each side, and the patient’s head position was standardized throughout. A full-mouth photographic series of 11 images per patient was acquired, capturing all relevant soft-tissue regions for subsequent inflammatory scoring.</w:t>
+      </w:r>
+    </w:p>
+    <w:p>
+      <w:pPr>
+        <w:numPr>
+          <w:ilvl w:val="0"/>
+          <w:numId w:val="1001"/>
+        </w:numPr>
+      </w:pPr>
+      <w:r>
+        <w:rPr>
+          <w:b/>
+          <w:bCs/>
+        </w:rPr>
+        <w:t xml:space="preserve">Hard-Tissue Modality (</w:t>
+      </w:r>
+      <m:oMath>
+        <m:sSub>
+          <m:e>
+            <m:r>
+              <m:t>P</m:t>
+            </m:r>
+          </m:e>
+          <m:sub>
+            <m:r>
+              <m:t>h</m:t>
+            </m:r>
+            <m:r>
+              <m:t>a</m:t>
+            </m:r>
+            <m:r>
+              <m:t>r</m:t>
+            </m:r>
+            <m:r>
+              <m:t>d</m:t>
+            </m:r>
+          </m:sub>
+        </m:sSub>
+      </m:oMath>
+      <w:r>
+        <w:rPr>
+          <w:b/>
+          <w:bCs/>
+        </w:rPr>
+        <w:t xml:space="preserve">):</w:t>
+      </w:r>
+      <w:r>
+        <w:t xml:space="preserve"> </w:t>
+      </w:r>
+      <w:r>
+        <w:t xml:space="preserve">Hard-tissue assessment was performed using panoramic radiography via Rotational Slit-Beam Tomography on conventional film. Full-mouth radiographic coverage was obtained for all patients. Radiographic features extracted included bone crest levels and relevant hard-tissue morphological findings. All radiographs were independently evaluated by three expert clinicians to ensure diagnostic reliability.</w:t>
+      </w:r>
+    </w:p>
+    <w:p>
+      <w:pPr>
+        <w:numPr>
+          <w:ilvl w:val="0"/>
+          <w:numId w:val="1001"/>
+        </w:numPr>
+      </w:pPr>
+      <w:r>
+        <w:rPr>
+          <w:b/>
+          <w:bCs/>
+        </w:rPr>
+        <w:t xml:space="preserve">Questionnaire (</w:t>
+      </w:r>
+      <m:oMath>
+        <m:sSub>
+          <m:e>
+            <m:r>
+              <m:t>P</m:t>
+            </m:r>
+          </m:e>
+          <m:sub>
+            <m:r>
+              <m:t>t</m:t>
+            </m:r>
+            <m:r>
+              <m:t>a</m:t>
+            </m:r>
+            <m:r>
+              <m:t>b</m:t>
+            </m:r>
+          </m:sub>
+        </m:sSub>
+      </m:oMath>
+      <w:r>
+        <w:rPr>
+          <w:b/>
+          <w:bCs/>
+        </w:rPr>
+        <w:t xml:space="preserve">):</w:t>
+      </w:r>
+      <w:r>
+        <w:t xml:space="preserve"> </w:t>
+      </w:r>
+      <w:r>
+        <w:t xml:space="preserve">Prior to clinical examination, each participant completed a standardized 45-item paper-based questionnaire covering five domains: demographic characteristics, vaping and nicotine habits, oral hygiene practices, lifestyle factors, and self-reported periodontal symptoms. Paper administration before examination ensured responses were independent of clinical findings and examiner influence.</w:t>
+      </w:r>
+    </w:p>
+    <w:p>
+      <w:pPr>
+        <w:numPr>
+          <w:ilvl w:val="0"/>
+          <w:numId w:val="1001"/>
+        </w:numPr>
+      </w:pPr>
+      <w:r>
+        <w:rPr>
+          <w:b/>
+          <w:bCs/>
+        </w:rPr>
+        <w:t xml:space="preserve">Data Recording and Anonymization:</w:t>
+      </w:r>
+      <w:r>
+        <w:t xml:space="preserve"> </w:t>
+      </w:r>
+      <w:r>
+        <w:t xml:space="preserve">All acquired data were stored on a password-protected, encrypted computer accessible exclusively to the principal investigators (M.N. and A.A.). Patient identifiers were removed at the point of data entry and replaced with anonymous numerical codes, ensuring no personally identifiable information was retained within the dataset. All procedures were conducted in full compliance with institutional data protection protocols and the Declaration of Helsinki.</w:t>
+      </w:r>
+    </w:p>
+    <w:bookmarkEnd w:id="14"/>
     <w:bookmarkEnd w:id="15"/>
-    <w:bookmarkEnd w:id="16"/>
-    <w:bookmarkStart w:id="17" w:name="X9571a02732a0f3e73b0dd413a560333223087c4"/>
-    <w:p>
-      <w:pPr>
-        <w:pStyle w:val="Heading3"/>
-      </w:pPr>
-      <w:r>
-        <w:t xml:space="preserve">All three modalities were acquired during a single standardized clinical visit by a single calibrated examiner (M.N.) to minimize inter-operator variability.</w:t>
-      </w:r>
-    </w:p>
-    <w:bookmarkEnd w:id="17"/>
-    <w:bookmarkStart w:id="18" w:name="X2f5d799aa539d5c796eaab135a228cb19dd4b3a"/>
-    <w:p>
-      <w:pPr>
-        <w:pStyle w:val="Heading3"/>
-      </w:pPr>
-      <w:r>
-        <w:t xml:space="preserve">• Soft-Tissue Modality (Psoft): Intraoral clinical photography was performed using a Canon EOS 4000D equipped with a 100mm macro lens and twin flash system, calibrated to approximately 5500K color temperature. A standardized exposure protocol was applied across all patients (f/22, 1/200s, ISO 100) to ensure consistent color rendition and depth of field. Bilateral cheek retractors were used for each side, and the patient’s head position was standardized throughout. A full-mouth photographic series of 11 images per patient was acquired, capturing all relevant soft-tissue regions for subsequent inflammatory scoring.</w:t>
-      </w:r>
-    </w:p>
-    <w:bookmarkEnd w:id="18"/>
-    <w:bookmarkStart w:id="19" w:name="Xf69ea3dfa9b0c88a7002167483f0042649475f3"/>
-    <w:p>
-      <w:pPr>
-        <w:pStyle w:val="Heading3"/>
-      </w:pPr>
-      <w:r>
-        <w:t xml:space="preserve">• Hard-Tissue Modality (Phard): Hard-tissue assessment was performed using panoramic radiography via Rotational Slit-Beam Tomography on conventional film. Full-mouth radiographic coverage was obtained for all patients. Radiographic features extracted included bone crest levels and relevant hard-tissue morphological findings. All radiographs were independently evaluated by three expert clinicians to ensure diagnostic reliability.</w:t>
-      </w:r>
-    </w:p>
-    <w:bookmarkEnd w:id="19"/>
-    <w:bookmarkStart w:id="20" w:name="Xda7a825b64115e291a3548817e7aa2b879e89d1"/>
-    <w:p>
-      <w:pPr>
-        <w:pStyle w:val="Heading3"/>
-      </w:pPr>
-      <w:r>
-        <w:t xml:space="preserve">• Questionnaire (Ptab): Prior to clinical examination, each participant completed a standardized 45-item paper-based questionnaire covering five domains: demographic characteristics, vaping and nicotine habits, oral hygiene practices, lifestyle factors, and self-reported periodontal symptoms. Paper administration before examination ensured responses were independent of clinical findings and examiner influence.</w:t>
-      </w:r>
-    </w:p>
-    <w:bookmarkEnd w:id="20"/>
-    <w:bookmarkStart w:id="21" w:name="X2b8d34ec5fd363156842708fd97df9388618183"/>
-    <w:p>
-      <w:pPr>
-        <w:pStyle w:val="Heading3"/>
-      </w:pPr>
-      <w:r>
-        <w:t xml:space="preserve">• Data Recording and Anonymization: All acquired data were stored on a password-protected, encrypted computer accessible exclusively to the principal investigators (M.N. and A.A.). Patient identifiers were removed at the point of data entry and replaced with anonymous numerical codes, ensuring no personally identifiable information was retained within the dataset. All procedures were conducted in full compliance with institutional data protection protocols and the Declaration of Helsinki.</w:t>
-      </w:r>
-    </w:p>
-    <w:bookmarkEnd w:id="21"/>
-    <w:bookmarkStart w:id="25" w:name="Xd48a83b1ad3b9451c368ed30a969ed611fcf4b6"/>
+    <w:bookmarkStart w:id="16" w:name="Xd48a83b1ad3b9451c368ed30a969ed611fcf4b6"/>
     <w:p>
       <w:pPr>
         <w:pStyle w:val="Heading3"/>
@@ -1327,9 +1454,11 @@
         <w:t xml:space="preserve">2.2 Data Preprocessing and Modality Alignment</w:t>
       </w:r>
     </w:p>
-    <w:p>
-      <w:pPr>
-        <w:pStyle w:val="FirstParagraph"/>
+    <w:bookmarkEnd w:id="16"/>
+    <w:bookmarkStart w:id="17" w:name="X861537386c6bdfff65553c81db9c1e81e942b2e"/>
+    <w:p>
+      <w:pPr>
+        <w:pStyle w:val="Heading3"/>
       </w:pPr>
       <w:r>
         <w:rPr>
@@ -1341,70 +1470,108 @@
     </w:p>
     <w:p>
       <w:pPr>
+        <w:pStyle w:val="FirstParagraph"/>
+      </w:pPr>
+      <w:r>
+        <w:t xml:space="preserve">Given the micro-cohort scale of the present dataset, deploying</w:t>
+      </w:r>
+      <w:r>
+        <w:t xml:space="preserve"> </w:t>
+      </w:r>
+      <w:r>
+        <w:t xml:space="preserve">high-dimensional deep learning encoders such as convolutional neural</w:t>
+      </w:r>
+      <w:r>
+        <w:t xml:space="preserve"> </w:t>
+      </w:r>
+      <w:r>
+        <w:t xml:space="preserve">networks would introduce severe dimensionality and overfitting risks.</w:t>
+      </w:r>
+      <w:r>
+        <w:t xml:space="preserve"> </w:t>
+      </w:r>
+      <w:r>
+        <w:t xml:space="preserve">Instead, a continuous 1–10 Soft-Tissue Intensity Index was developed,</w:t>
+      </w:r>
+      <w:r>
+        <w:t xml:space="preserve"> </w:t>
+      </w:r>
+      <w:r>
+        <w:t xml:space="preserve">adapted from the validated Lobene Modified Gingival Index (MGI) (Lobene</w:t>
+      </w:r>
+      <w:r>
+        <w:t xml:space="preserve"> </w:t>
+      </w:r>
+      <w:r>
+        <w:t xml:space="preserve">et al., 1986). While the original MGI operates on a 0–4 ordinal scale,</w:t>
+      </w:r>
+      <w:r>
+        <w:t xml:space="preserve"> </w:t>
+      </w:r>
+      <w:r>
+        <w:t xml:space="preserve">its coarse granularity is insufficient for machine learning applications</w:t>
+      </w:r>
+      <w:r>
+        <w:t xml:space="preserve"> </w:t>
+      </w:r>
+      <w:r>
+        <w:t xml:space="preserve">requiring continuous, fine-grained feature discrimination. The expanded</w:t>
+      </w:r>
+      <w:r>
+        <w:t xml:space="preserve"> </w:t>
+      </w:r>
+      <w:r>
+        <w:t xml:space="preserve">1–10 scale preserves the clinical logic of the MGI while providing the</w:t>
+      </w:r>
+      <w:r>
+        <w:t xml:space="preserve"> </w:t>
+      </w:r>
+      <w:r>
+        <w:t xml:space="preserve">numerical resolution necessary for gradient-based optimization and</w:t>
+      </w:r>
+      <w:r>
+        <w:t xml:space="preserve"> </w:t>
+      </w:r>
+      <w:r>
+        <w:t xml:space="preserve">meaningful inter-patient differentiation.</w:t>
+      </w:r>
+    </w:p>
+    <w:p>
+      <w:pPr>
         <w:pStyle w:val="BodyText"/>
       </w:pPr>
       <w:r>
-        <w:t xml:space="preserve">Given the micro-cohort scale of the present dataset, deploying</w:t>
-      </w:r>
-      <w:r>
-        <w:t xml:space="preserve"> </w:t>
-      </w:r>
-      <w:r>
-        <w:t xml:space="preserve">high-dimensional deep learning encoders such as convolutional neural</w:t>
-      </w:r>
-      <w:r>
-        <w:t xml:space="preserve"> </w:t>
-      </w:r>
-      <w:r>
-        <w:t xml:space="preserve">networks would introduce severe dimensionality and overfitting risks.</w:t>
-      </w:r>
-      <w:r>
-        <w:t xml:space="preserve"> </w:t>
-      </w:r>
-      <w:r>
-        <w:t xml:space="preserve">Instead, a continuous 1–10 Soft-Tissue Intensity Index was developed,</w:t>
-      </w:r>
-      <w:r>
-        <w:t xml:space="preserve"> </w:t>
-      </w:r>
-      <w:r>
-        <w:t xml:space="preserve">adapted from the validated Lobene Modified Gingival Index (MGI) (Lobene</w:t>
-      </w:r>
-      <w:r>
-        <w:t xml:space="preserve"> </w:t>
-      </w:r>
-      <w:r>
-        <w:t xml:space="preserve">et al., 1986). While the original MGI operates on a 0–4 ordinal scale,</w:t>
-      </w:r>
-      <w:r>
-        <w:t xml:space="preserve"> </w:t>
-      </w:r>
-      <w:r>
-        <w:t xml:space="preserve">its coarse granularity is insufficient for machine learning applications</w:t>
-      </w:r>
-      <w:r>
-        <w:t xml:space="preserve"> </w:t>
-      </w:r>
-      <w:r>
-        <w:t xml:space="preserve">requiring continuous, fine-grained feature discrimination. The expanded</w:t>
-      </w:r>
-      <w:r>
-        <w:t xml:space="preserve"> </w:t>
-      </w:r>
-      <w:r>
-        <w:t xml:space="preserve">1–10 scale preserves the clinical logic of the MGI while providing the</w:t>
-      </w:r>
-      <w:r>
-        <w:t xml:space="preserve"> </w:t>
-      </w:r>
-      <w:r>
-        <w:t xml:space="preserve">numerical resolution necessary for gradient-based optimization and</w:t>
-      </w:r>
-      <w:r>
-        <w:t xml:space="preserve"> </w:t>
-      </w:r>
-      <w:r>
-        <w:t xml:space="preserve">meaningful inter-patient differentiation.</w:t>
+        <w:t xml:space="preserve">The index explicitly measures surface tissue characteristics observable</w:t>
+      </w:r>
+      <w:r>
+        <w:t xml:space="preserve"> </w:t>
+      </w:r>
+      <w:r>
+        <w:t xml:space="preserve">in standardized clinical photography and does not attempt to derive</w:t>
+      </w:r>
+      <w:r>
+        <w:t xml:space="preserve"> </w:t>
+      </w:r>
+      <w:r>
+        <w:t xml:space="preserve">dimensional or volumetric measurements from two-dimensional photographic</w:t>
+      </w:r>
+      <w:r>
+        <w:t xml:space="preserve"> </w:t>
+      </w:r>
+      <w:r>
+        <w:t xml:space="preserve">data. Scores reflect six observable tissue properties: gingival color</w:t>
+      </w:r>
+      <w:r>
+        <w:t xml:space="preserve"> </w:t>
+      </w:r>
+      <w:r>
+        <w:t xml:space="preserve">and erythema intensity, marginal contour, surface texture, edema</w:t>
+      </w:r>
+      <w:r>
+        <w:t xml:space="preserve"> </w:t>
+      </w:r>
+      <w:r>
+        <w:t xml:space="preserve">severity, glazing, and spontaneous hemorrhagic tendency.</w:t>
       </w:r>
     </w:p>
     <w:p>
@@ -1412,44 +1579,6 @@
         <w:pStyle w:val="BodyText"/>
       </w:pPr>
       <w:r>
-        <w:t xml:space="preserve">The index explicitly measures surface tissue characteristics observable</w:t>
-      </w:r>
-      <w:r>
-        <w:t xml:space="preserve"> </w:t>
-      </w:r>
-      <w:r>
-        <w:t xml:space="preserve">in standardized clinical photography and does not attempt to derive</w:t>
-      </w:r>
-      <w:r>
-        <w:t xml:space="preserve"> </w:t>
-      </w:r>
-      <w:r>
-        <w:t xml:space="preserve">dimensional or volumetric measurements from two-dimensional photographic</w:t>
-      </w:r>
-      <w:r>
-        <w:t xml:space="preserve"> </w:t>
-      </w:r>
-      <w:r>
-        <w:t xml:space="preserve">data. Scores reflect six observable tissue properties: gingival color</w:t>
-      </w:r>
-      <w:r>
-        <w:t xml:space="preserve"> </w:t>
-      </w:r>
-      <w:r>
-        <w:t xml:space="preserve">and erythema intensity, marginal contour, surface texture, edema</w:t>
-      </w:r>
-      <w:r>
-        <w:t xml:space="preserve"> </w:t>
-      </w:r>
-      <w:r>
-        <w:t xml:space="preserve">severity, glazing, and spontaneous hemorrhagic tendency.</w:t>
-      </w:r>
-    </w:p>
-    <w:p>
-      <w:pPr>
-        <w:pStyle w:val="BodyText"/>
-      </w:pPr>
-      <w:r>
         <w:t xml:space="preserve">Three independent expert clinicians, blinded to patient vaping status</w:t>
       </w:r>
       <w:r>
@@ -1477,9 +1606,11 @@
         <w:t xml:space="preserve">and is reported in Section 2.2.4.</w:t>
       </w:r>
     </w:p>
-    <w:p>
-      <w:pPr>
-        <w:pStyle w:val="BodyText"/>
+    <w:bookmarkEnd w:id="17"/>
+    <w:bookmarkStart w:id="21" w:name="structural-radiographic-scaling"/>
+    <w:p>
+      <w:pPr>
+        <w:pStyle w:val="Heading3"/>
       </w:pPr>
       <w:r>
         <w:rPr>
@@ -1491,101 +1622,101 @@
     </w:p>
     <w:p>
       <w:pPr>
+        <w:pStyle w:val="FirstParagraph"/>
+      </w:pPr>
+      <w:r>
+        <w:t xml:space="preserve">Parallel to the soft-tissue indexing approach, panoramic radiographs</w:t>
+      </w:r>
+      <w:r>
+        <w:t xml:space="preserve"> </w:t>
+      </w:r>
+      <w:r>
+        <w:t xml:space="preserve">were converted into a continuous 1.0–10.0 Radiographic Severity Index</w:t>
+      </w:r>
+      <w:r>
+        <w:t xml:space="preserve"> </w:t>
+      </w:r>
+      <w:r>
+        <w:t xml:space="preserve">to ensure architectural consistency across all modalities and eliminate</w:t>
+      </w:r>
+      <w:r>
+        <w:t xml:space="preserve"> </w:t>
+      </w:r>
+      <w:r>
+        <w:t xml:space="preserve">dimensional incompatibility within the feature fusion pipeline. The</w:t>
+      </w:r>
+      <w:r>
+        <w:t xml:space="preserve"> </w:t>
+      </w:r>
+      <w:r>
+        <w:t xml:space="preserve">scale was developed as a continuous numerical expansion of the 2017</w:t>
+      </w:r>
+      <w:r>
+        <w:t xml:space="preserve"> </w:t>
+      </w:r>
+      <w:r>
+        <w:t xml:space="preserve">AAP/EFP Periodontal Classification staging criteria (Papapanou et al.,</w:t>
+      </w:r>
+      <w:r>
+        <w:t xml:space="preserve"> </w:t>
+      </w:r>
+      <w:r>
+        <w:t xml:space="preserve">2018), mapping established clinical staging thresholds onto a</w:t>
+      </w:r>
+      <w:r>
+        <w:t xml:space="preserve"> </w:t>
+      </w:r>
+      <w:r>
+        <w:t xml:space="preserve">fine-grained, machine-readable range. Crucially, the Radiographic</w:t>
+      </w:r>
+      <w:r>
+        <w:t xml:space="preserve"> </w:t>
+      </w:r>
+      <w:r>
+        <w:t xml:space="preserve">Severity Index represents a relative continuous scaling of observable</w:t>
+      </w:r>
+      <w:r>
+        <w:t xml:space="preserve"> </w:t>
+      </w:r>
+      <w:r>
+        <w:t xml:space="preserve">hard-tissue pathology and does not constitute absolute millimeter bone</w:t>
+      </w:r>
+      <w:r>
+        <w:t xml:space="preserve"> </w:t>
+      </w:r>
+      <w:r>
+        <w:t xml:space="preserve">level measurements, which would require a standardized long-cone</w:t>
+      </w:r>
+      <w:r>
+        <w:t xml:space="preserve"> </w:t>
+      </w:r>
+      <w:r>
+        <w:t xml:space="preserve">paralleling technique with calibrated grids. Instead, the continuous</w:t>
+      </w:r>
+      <w:r>
+        <w:t xml:space="preserve"> </w:t>
+      </w:r>
+      <w:r>
+        <w:t xml:space="preserve">scores reflect alveolar bone crest levels, the extent and pattern of</w:t>
+      </w:r>
+      <w:r>
+        <w:t xml:space="preserve"> </w:t>
+      </w:r>
+      <w:r>
+        <w:t xml:space="preserve">bone loss, and furcation involvement as observed on standardized</w:t>
+      </w:r>
+      <w:r>
+        <w:t xml:space="preserve"> </w:t>
+      </w:r>
+      <w:r>
+        <w:t xml:space="preserve">panoramic radiography.</w:t>
+      </w:r>
+    </w:p>
+    <w:p>
+      <w:pPr>
         <w:pStyle w:val="BodyText"/>
       </w:pPr>
       <w:r>
-        <w:t xml:space="preserve">Parallel to the soft-tissue indexing approach, panoramic radiographs</w:t>
-      </w:r>
-      <w:r>
-        <w:t xml:space="preserve"> </w:t>
-      </w:r>
-      <w:r>
-        <w:t xml:space="preserve">were converted into a continuous 1.0–10.0 Radiographic Severity Index</w:t>
-      </w:r>
-      <w:r>
-        <w:t xml:space="preserve"> </w:t>
-      </w:r>
-      <w:r>
-        <w:t xml:space="preserve">to ensure architectural consistency across all modalities and eliminate</w:t>
-      </w:r>
-      <w:r>
-        <w:t xml:space="preserve"> </w:t>
-      </w:r>
-      <w:r>
-        <w:t xml:space="preserve">dimensional incompatibility within the feature fusion pipeline. The</w:t>
-      </w:r>
-      <w:r>
-        <w:t xml:space="preserve"> </w:t>
-      </w:r>
-      <w:r>
-        <w:t xml:space="preserve">scale was developed as a continuous numerical expansion of the 2017</w:t>
-      </w:r>
-      <w:r>
-        <w:t xml:space="preserve"> </w:t>
-      </w:r>
-      <w:r>
-        <w:t xml:space="preserve">AAP/EFP Periodontal Classification staging criteria (Papapanou et al.,</w:t>
-      </w:r>
-      <w:r>
-        <w:t xml:space="preserve"> </w:t>
-      </w:r>
-      <w:r>
-        <w:t xml:space="preserve">2018), mapping established clinical staging thresholds onto a</w:t>
-      </w:r>
-      <w:r>
-        <w:t xml:space="preserve"> </w:t>
-      </w:r>
-      <w:r>
-        <w:t xml:space="preserve">fine-grained, machine-readable range. Crucially, the Radiographic</w:t>
-      </w:r>
-      <w:r>
-        <w:t xml:space="preserve"> </w:t>
-      </w:r>
-      <w:r>
-        <w:t xml:space="preserve">Severity Index represents a relative continuous scaling of observable</w:t>
-      </w:r>
-      <w:r>
-        <w:t xml:space="preserve"> </w:t>
-      </w:r>
-      <w:r>
-        <w:t xml:space="preserve">hard-tissue pathology and does not constitute absolute millimeter bone</w:t>
-      </w:r>
-      <w:r>
-        <w:t xml:space="preserve"> </w:t>
-      </w:r>
-      <w:r>
-        <w:t xml:space="preserve">level measurements, which would require a standardized long-cone</w:t>
-      </w:r>
-      <w:r>
-        <w:t xml:space="preserve"> </w:t>
-      </w:r>
-      <w:r>
-        <w:t xml:space="preserve">paralleling technique with calibrated grids. Instead, the continuous</w:t>
-      </w:r>
-      <w:r>
-        <w:t xml:space="preserve"> </w:t>
-      </w:r>
-      <w:r>
-        <w:t xml:space="preserve">scores reflect alveolar bone crest levels, the extent and pattern of</w:t>
-      </w:r>
-      <w:r>
-        <w:t xml:space="preserve"> </w:t>
-      </w:r>
-      <w:r>
-        <w:t xml:space="preserve">bone loss, and furcation involvement as observed on standardized</w:t>
-      </w:r>
-      <w:r>
-        <w:t xml:space="preserve"> </w:t>
-      </w:r>
-      <w:r>
-        <w:t xml:space="preserve">panoramic radiography.</w:t>
-      </w:r>
-    </w:p>
-    <w:p>
-      <w:pPr>
-        <w:pStyle w:val="BodyText"/>
-      </w:pPr>
-      <w:r>
         <w:t xml:space="preserve">Three independent expert clinicians, blinded to patient vaping status</w:t>
       </w:r>
       <w:r>
@@ -1619,7 +1750,7 @@
         <w:t xml:space="preserve">reliability is reported in Section 2.2.4.</w:t>
       </w:r>
     </w:p>
-    <w:bookmarkStart w:id="22" w:name="X0eecc9448bcffffe401e3247fecc5fa1e47136e"/>
+    <w:bookmarkStart w:id="18" w:name="X0eecc9448bcffffe401e3247fecc5fa1e47136e"/>
     <w:p>
       <w:pPr>
         <w:pStyle w:val="Heading4"/>
@@ -2000,8 +2131,8 @@
         <w:t xml:space="preserve">selection.</w:t>
       </w:r>
     </w:p>
-    <w:bookmarkEnd w:id="22"/>
-    <w:bookmarkStart w:id="23" w:name="Xb380afb1a84a324667d37cd3c611c4bdb483640"/>
+    <w:bookmarkEnd w:id="18"/>
+    <w:bookmarkStart w:id="19" w:name="Xb380afb1a84a324667d37cd3c611c4bdb483640"/>
     <w:p>
       <w:pPr>
         <w:pStyle w:val="Heading4"/>
@@ -2134,8 +2265,8 @@
         <w:t xml:space="preserve">future multi-center validation trials.</w:t>
       </w:r>
     </w:p>
-    <w:bookmarkEnd w:id="23"/>
-    <w:bookmarkStart w:id="24" w:name="Xe3e41bf8311515df77521db64a4f80e13b0773b"/>
+    <w:bookmarkEnd w:id="19"/>
+    <w:bookmarkStart w:id="20" w:name="Xe3e41bf8311515df77521db64a4f80e13b0773b"/>
     <w:p>
       <w:pPr>
         <w:pStyle w:val="Heading4"/>
@@ -2263,7 +2394,7 @@
       <w:pPr>
         <w:numPr>
           <w:ilvl w:val="0"/>
-          <w:numId w:val="1001"/>
+          <w:numId w:val="1002"/>
         </w:numPr>
       </w:pPr>
       <w:r>
@@ -2495,7 +2626,7 @@
       <w:pPr>
         <w:numPr>
           <w:ilvl w:val="0"/>
-          <w:numId w:val="1001"/>
+          <w:numId w:val="1002"/>
         </w:numPr>
       </w:pPr>
       <w:r>
@@ -2665,7 +2796,7 @@
       <w:pPr>
         <w:numPr>
           <w:ilvl w:val="0"/>
-          <w:numId w:val="1001"/>
+          <w:numId w:val="1002"/>
         </w:numPr>
       </w:pPr>
       <w:r>
@@ -2953,9 +3084,9 @@
         <w:t xml:space="preserve">performing raw feature learning.</w:t>
       </w:r>
     </w:p>
-    <w:bookmarkEnd w:id="24"/>
-    <w:bookmarkEnd w:id="25"/>
-    <w:bookmarkStart w:id="35" w:name="X647a79cbfa3451ce28634ce9e9e197d95ea0133"/>
+    <w:bookmarkEnd w:id="20"/>
+    <w:bookmarkEnd w:id="21"/>
+    <w:bookmarkStart w:id="31" w:name="X647a79cbfa3451ce28634ce9e9e197d95ea0133"/>
     <w:p>
       <w:pPr>
         <w:pStyle w:val="Heading3"/>
@@ -2968,7 +3099,7 @@
         <w:t xml:space="preserve">2.3 The Clinical Attention Framework (CAF) Architecture</w:t>
       </w:r>
     </w:p>
-    <w:bookmarkStart w:id="29" w:name="architectural-overview"/>
+    <w:bookmarkStart w:id="25" w:name="architectural-overview"/>
     <w:p>
       <w:pPr>
         <w:pStyle w:val="Heading4"/>
@@ -3022,18 +3153,18 @@
           <wp:inline>
             <wp:extent cx="5334000" cy="6866758"/>
             <wp:effectExtent b="0" l="0" r="0" t="0"/>
-            <wp:docPr descr="Clinical Attention Framework (CAF) Architecture Diagram. The schematic shows how patient context features (x_{gate}) pass through a linear gating layer to generate modality logits. A Softmax function converts these logits to dynamic routing probabilities (P_{tab}, P_{soft}, P_{hard}) that scale aligned modality scores (s_{tab}, s_{soft}, s_{hard}). The final diagnostic prediction logit is scaled and shifted before being passed to a Sigmoid function." title="" id="27" name="Picture"/>
+            <wp:docPr descr="Clinical Attention Framework (CAF) Architecture Diagram. The schematic shows how patient context features (x_{gate}) pass through a linear gating layer to generate modality logits. A Softmax function converts these logits to dynamic routing probabilities (P_{tab}, P_{soft}, P_{hard}) that scale aligned modality scores (s_{tab}, s_{soft}, s_{hard}). The final diagnostic prediction logit is scaled and shifted before being passed to a Sigmoid function." title="" id="23" name="Picture"/>
             <a:graphic>
               <a:graphicData uri="http://schemas.openxmlformats.org/drawingml/2006/picture">
                 <pic:pic>
                   <pic:nvPicPr>
-                    <pic:cNvPr descr="figure1_architecture.png" id="28" name="Picture"/>
+                    <pic:cNvPr descr="figure1_architecture.png" id="24" name="Picture"/>
                     <pic:cNvPicPr>
                       <a:picLocks noChangeArrowheads="1" noChangeAspect="1"/>
                     </pic:cNvPicPr>
                   </pic:nvPicPr>
                   <pic:blipFill>
-                    <a:blip r:embed="rId26"/>
+                    <a:blip r:embed="rId22"/>
                     <a:stretch>
                       <a:fillRect/>
                     </a:stretch>
@@ -3344,8 +3475,8 @@
         <w:t xml:space="preserve">scaled and shifted before being passed to a Sigmoid function.</w:t>
       </w:r>
     </w:p>
-    <w:bookmarkEnd w:id="29"/>
-    <w:bookmarkStart w:id="30" w:name="the-confounder-driven-gating-matrix"/>
+    <w:bookmarkEnd w:id="25"/>
+    <w:bookmarkStart w:id="26" w:name="the-confounder-driven-gating-matrix"/>
     <w:p>
       <w:pPr>
         <w:pStyle w:val="Heading4"/>
@@ -3792,8 +3923,8 @@
         <w:t xml:space="preserve">demographic and vaping habits.</w:t>
       </w:r>
     </w:p>
-    <w:bookmarkEnd w:id="30"/>
-    <w:bookmarkStart w:id="31" w:name="dynamic-reliability-routing"/>
+    <w:bookmarkEnd w:id="26"/>
+    <w:bookmarkStart w:id="27" w:name="dynamic-reliability-routing"/>
     <w:p>
       <w:pPr>
         <w:pStyle w:val="Heading4"/>
@@ -4169,8 +4300,8 @@
         <w:t xml:space="preserve">for the specific patient.</w:t>
       </w:r>
     </w:p>
-    <w:bookmarkEnd w:id="31"/>
-    <w:bookmarkStart w:id="32" w:name="graceful-modality-down-weighting"/>
+    <w:bookmarkEnd w:id="27"/>
+    <w:bookmarkStart w:id="28" w:name="graceful-modality-down-weighting"/>
     <w:p>
       <w:pPr>
         <w:pStyle w:val="Heading4"/>
@@ -4431,8 +4562,8 @@
         <w:t xml:space="preserve">decision from non-informative noise injection.</w:t>
       </w:r>
     </w:p>
-    <w:bookmarkEnd w:id="32"/>
-    <w:bookmarkStart w:id="33" w:name="Xed09740fafb3d8dd43aba71ee8dccbf93d2f980"/>
+    <w:bookmarkEnd w:id="28"/>
+    <w:bookmarkStart w:id="29" w:name="Xed09740fafb3d8dd43aba71ee8dccbf93d2f980"/>
     <w:p>
       <w:pPr>
         <w:pStyle w:val="Heading4"/>
@@ -5138,8 +5269,8 @@
         <w:t xml:space="preserve">solutions (as empirically verified in our ablation studies, Section 3).</w:t>
       </w:r>
     </w:p>
-    <w:bookmarkEnd w:id="33"/>
-    <w:bookmarkStart w:id="34" w:name="X023678b7c81172a56375e9a5a60798da9ce0329"/>
+    <w:bookmarkEnd w:id="29"/>
+    <w:bookmarkStart w:id="30" w:name="X023678b7c81172a56375e9a5a60798da9ce0329"/>
     <w:p>
       <w:pPr>
         <w:pStyle w:val="Heading4"/>
@@ -5987,9 +6118,9 @@
         <w:t xml:space="preserve">to ensure deterministic data splitting and weight initialization.</w:t>
       </w:r>
     </w:p>
-    <w:bookmarkEnd w:id="34"/>
-    <w:bookmarkEnd w:id="35"/>
-    <w:bookmarkStart w:id="42" w:name="X5c76c77e72c30973c768544caf24dcff195a892"/>
+    <w:bookmarkEnd w:id="30"/>
+    <w:bookmarkEnd w:id="31"/>
+    <w:bookmarkStart w:id="38" w:name="X5c76c77e72c30973c768544caf24dcff195a892"/>
     <w:p>
       <w:pPr>
         <w:pStyle w:val="Heading3"/>
@@ -6002,7 +6133,7 @@
         <w:t xml:space="preserve">2.4 Experimental Setup and Statistical Validation</w:t>
       </w:r>
     </w:p>
-    <w:bookmarkStart w:id="36" w:name="Xd57c52569c9d0b5cc501956d65ceba7b6da2a69"/>
+    <w:bookmarkStart w:id="32" w:name="Xd57c52569c9d0b5cc501956d65ceba7b6da2a69"/>
     <w:p>
       <w:pPr>
         <w:pStyle w:val="Heading4"/>
@@ -6033,7 +6164,7 @@
       <w:pPr>
         <w:numPr>
           <w:ilvl w:val="0"/>
-          <w:numId w:val="1002"/>
+          <w:numId w:val="1003"/>
         </w:numPr>
       </w:pPr>
       <w:r>
@@ -6048,7 +6179,7 @@
       <w:pPr>
         <w:numPr>
           <w:ilvl w:val="1"/>
-          <w:numId w:val="1003"/>
+          <w:numId w:val="1004"/>
         </w:numPr>
       </w:pPr>
       <w:r>
@@ -6119,7 +6250,7 @@
       <w:pPr>
         <w:numPr>
           <w:ilvl w:val="1"/>
-          <w:numId w:val="1003"/>
+          <w:numId w:val="1004"/>
         </w:numPr>
       </w:pPr>
       <w:r>
@@ -6208,7 +6339,7 @@
       <w:pPr>
         <w:numPr>
           <w:ilvl w:val="0"/>
-          <w:numId w:val="1002"/>
+          <w:numId w:val="1003"/>
         </w:numPr>
       </w:pPr>
       <w:r>
@@ -6224,7 +6355,7 @@
         <w:pStyle w:val="Compact"/>
         <w:numPr>
           <w:ilvl w:val="1"/>
-          <w:numId w:val="1004"/>
+          <w:numId w:val="1005"/>
         </w:numPr>
       </w:pPr>
       <w:r>
@@ -6451,7 +6582,7 @@
       <w:pPr>
         <w:numPr>
           <w:ilvl w:val="0"/>
-          <w:numId w:val="1002"/>
+          <w:numId w:val="1003"/>
         </w:numPr>
       </w:pPr>
       <w:r>
@@ -6466,7 +6597,7 @@
       <w:pPr>
         <w:numPr>
           <w:ilvl w:val="1"/>
-          <w:numId w:val="1005"/>
+          <w:numId w:val="1006"/>
         </w:numPr>
       </w:pPr>
       <w:r>
@@ -6517,7 +6648,7 @@
       <w:pPr>
         <w:numPr>
           <w:ilvl w:val="1"/>
-          <w:numId w:val="1005"/>
+          <w:numId w:val="1006"/>
         </w:numPr>
       </w:pPr>
       <w:r>
@@ -6558,8 +6689,8 @@
         <w:t xml:space="preserve">complex multiplicative cross-modal tensor representations.</w:t>
       </w:r>
     </w:p>
-    <w:bookmarkEnd w:id="36"/>
-    <w:bookmarkStart w:id="37" w:name="X4d64e8549e8340e480432e8b624970f60dec237"/>
+    <w:bookmarkEnd w:id="32"/>
+    <w:bookmarkStart w:id="33" w:name="X4d64e8549e8340e480432e8b624970f60dec237"/>
     <w:p>
       <w:pPr>
         <w:pStyle w:val="Heading4"/>
@@ -6798,8 +6929,8 @@
         <w:t xml:space="preserve">randomized model initializations.</w:t>
       </w:r>
     </w:p>
-    <w:bookmarkEnd w:id="37"/>
-    <w:bookmarkStart w:id="38" w:name="evaluation-metrics"/>
+    <w:bookmarkEnd w:id="33"/>
+    <w:bookmarkStart w:id="34" w:name="evaluation-metrics"/>
     <w:p>
       <w:pPr>
         <w:pStyle w:val="Heading4"/>
@@ -7035,8 +7166,8 @@
         <w:t xml:space="preserve">metric over all 100 seeds.</w:t>
       </w:r>
     </w:p>
-    <w:bookmarkEnd w:id="38"/>
-    <w:bookmarkStart w:id="39" w:name="Xa00519520be01c2890201d7a8015a057f9aa896"/>
+    <w:bookmarkEnd w:id="34"/>
+    <w:bookmarkStart w:id="35" w:name="Xa00519520be01c2890201d7a8015a057f9aa896"/>
     <w:p>
       <w:pPr>
         <w:pStyle w:val="Heading4"/>
@@ -7387,8 +7518,8 @@
         <w:t xml:space="preserve">visualize active modality routing and noise pruning.</w:t>
       </w:r>
     </w:p>
-    <w:bookmarkEnd w:id="39"/>
-    <w:bookmarkStart w:id="40" w:name="X396bde033346474c47fe85e60bd7bf57c1a1ee0"/>
+    <w:bookmarkEnd w:id="35"/>
+    <w:bookmarkStart w:id="36" w:name="X396bde033346474c47fe85e60bd7bf57c1a1ee0"/>
     <w:p>
       <w:pPr>
         <w:pStyle w:val="Heading4"/>
@@ -7425,7 +7556,7 @@
       <w:pPr>
         <w:numPr>
           <w:ilvl w:val="0"/>
-          <w:numId w:val="1006"/>
+          <w:numId w:val="1007"/>
         </w:numPr>
       </w:pPr>
       <w:r>
@@ -7496,7 +7627,7 @@
       <w:pPr>
         <w:numPr>
           <w:ilvl w:val="0"/>
-          <w:numId w:val="1006"/>
+          <w:numId w:val="1007"/>
         </w:numPr>
       </w:pPr>
       <w:r>
@@ -7529,7 +7660,7 @@
       <w:pPr>
         <w:numPr>
           <w:ilvl w:val="0"/>
-          <w:numId w:val="1006"/>
+          <w:numId w:val="1007"/>
         </w:numPr>
       </w:pPr>
       <w:r>
@@ -7717,7 +7848,7 @@
       <w:pPr>
         <w:numPr>
           <w:ilvl w:val="0"/>
-          <w:numId w:val="1006"/>
+          <w:numId w:val="1007"/>
         </w:numPr>
       </w:pPr>
       <w:r>
@@ -7781,8 +7912,8 @@
         <w:t xml:space="preserve">correct and wrong classification outcomes.</w:t>
       </w:r>
     </w:p>
-    <w:bookmarkEnd w:id="40"/>
-    <w:bookmarkStart w:id="41" w:name="implementation-details"/>
+    <w:bookmarkEnd w:id="36"/>
+    <w:bookmarkStart w:id="37" w:name="implementation-details"/>
     <w:p>
       <w:pPr>
         <w:pStyle w:val="Heading4"/>
@@ -7910,10 +8041,10 @@
         <w:t xml:space="preserve">.</w:t>
       </w:r>
     </w:p>
-    <w:bookmarkEnd w:id="41"/>
-    <w:bookmarkEnd w:id="42"/>
-    <w:bookmarkEnd w:id="43"/>
-    <w:bookmarkStart w:id="64" w:name="results"/>
+    <w:bookmarkEnd w:id="37"/>
+    <w:bookmarkEnd w:id="38"/>
+    <w:bookmarkEnd w:id="39"/>
+    <w:bookmarkStart w:id="60" w:name="results"/>
     <w:p>
       <w:pPr>
         <w:pStyle w:val="Heading2"/>
@@ -7926,7 +8057,7 @@
         <w:t xml:space="preserve">3. Results</w:t>
       </w:r>
     </w:p>
-    <w:bookmarkStart w:id="47" w:name="classification-performance"/>
+    <w:bookmarkStart w:id="43" w:name="classification-performance"/>
     <w:p>
       <w:pPr>
         <w:pStyle w:val="Heading3"/>
@@ -8988,18 +9119,18 @@
           <wp:inline>
             <wp:extent cx="5334000" cy="3200399"/>
             <wp:effectExtent b="0" l="0" r="0" t="0"/>
-            <wp:docPr descr="Seed Stability Analysis. Histogram of model classification accuracy across 100 random seed runs under leave-one-out cross-validation (LOOCV), demonstrating the stability and robustness of the regularized gating architecture." title="" id="45" name="Picture"/>
+            <wp:docPr descr="Seed Stability Analysis. Histogram of model classification accuracy across 100 random seed runs under leave-one-out cross-validation (LOOCV), demonstrating the stability and robustness of the regularized gating architecture." title="" id="41" name="Picture"/>
             <a:graphic>
               <a:graphicData uri="http://schemas.openxmlformats.org/drawingml/2006/picture">
                 <pic:pic>
                   <pic:nvPicPr>
-                    <pic:cNvPr descr="figure5_seed_stability.png" id="46" name="Picture"/>
+                    <pic:cNvPr descr="figure5_seed_stability.png" id="42" name="Picture"/>
                     <pic:cNvPicPr>
                       <a:picLocks noChangeArrowheads="1" noChangeAspect="1"/>
                     </pic:cNvPicPr>
                   </pic:nvPicPr>
                   <pic:blipFill>
-                    <a:blip r:embed="rId44"/>
+                    <a:blip r:embed="rId40"/>
                     <a:stretch>
                       <a:fillRect/>
                     </a:stretch>
@@ -9561,8 +9692,8 @@
         </w:tc>
       </w:tr>
     </w:tbl>
-    <w:bookmarkEnd w:id="47"/>
-    <w:bookmarkStart w:id="51" w:name="confounder-driven-routing-analysis"/>
+    <w:bookmarkEnd w:id="43"/>
+    <w:bookmarkStart w:id="47" w:name="confounder-driven-routing-analysis"/>
     <w:p>
       <w:pPr>
         <w:pStyle w:val="Heading3"/>
@@ -9631,7 +9762,7 @@
       <w:pPr>
         <w:numPr>
           <w:ilvl w:val="0"/>
-          <w:numId w:val="1007"/>
+          <w:numId w:val="1008"/>
         </w:numPr>
       </w:pPr>
       <w:r>
@@ -9715,7 +9846,7 @@
       <w:pPr>
         <w:numPr>
           <w:ilvl w:val="0"/>
-          <w:numId w:val="1007"/>
+          <w:numId w:val="1008"/>
         </w:numPr>
       </w:pPr>
       <w:r>
@@ -9857,7 +9988,7 @@
       <w:pPr>
         <w:numPr>
           <w:ilvl w:val="0"/>
-          <w:numId w:val="1008"/>
+          <w:numId w:val="1009"/>
         </w:numPr>
       </w:pPr>
       <w:r>
@@ -10009,7 +10140,7 @@
       <w:pPr>
         <w:numPr>
           <w:ilvl w:val="0"/>
-          <w:numId w:val="1008"/>
+          <w:numId w:val="1009"/>
         </w:numPr>
       </w:pPr>
       <w:r>
@@ -10109,7 +10240,7 @@
       <w:pPr>
         <w:numPr>
           <w:ilvl w:val="0"/>
-          <w:numId w:val="1008"/>
+          <w:numId w:val="1009"/>
         </w:numPr>
       </w:pPr>
       <w:r>
@@ -10158,18 +10289,18 @@
           <wp:inline>
             <wp:extent cx="5334000" cy="3810000"/>
             <wp:effectExtent b="0" l="0" r="0" t="0"/>
-            <wp:docPr descr="Clinical Soft-Tissue Attention Weight Distribution. Boxplot comparing P_{soft} between non-vapers (n=24, blue) and active vapers (n=22, red) across the N=46 cohort, averaged over 100 LOOCV seeds. Individual patient weights are shown as jittered points. The separation is statistically significant (Welch’s t = 16.44, Cohen’s d = 4.99, p &lt; 2.2 \times 10^{-16})." title="" id="49" name="Picture"/>
+            <wp:docPr descr="Clinical Soft-Tissue Attention Weight Distribution. Boxplot comparing P_{soft} between non-vapers (n=24, blue) and active vapers (n=22, red) across the N=46 cohort, averaged over 100 LOOCV seeds. Individual patient weights are shown as jittered points. The separation is statistically significant (Welch’s t = 16.44, Cohen’s d = 4.99, p &lt; 2.2 \times 10^{-16})." title="" id="45" name="Picture"/>
             <a:graphic>
               <a:graphicData uri="http://schemas.openxmlformats.org/drawingml/2006/picture">
                 <pic:pic>
                   <pic:nvPicPr>
-                    <pic:cNvPr descr="figure2_attention_boxplot.png" id="50" name="Picture"/>
+                    <pic:cNvPr descr="figure2_attention_boxplot.png" id="46" name="Picture"/>
                     <pic:cNvPicPr>
                       <a:picLocks noChangeArrowheads="1" noChangeAspect="1"/>
                     </pic:cNvPicPr>
                   </pic:nvPicPr>
                   <pic:blipFill>
-                    <a:blip r:embed="rId48"/>
+                    <a:blip r:embed="rId44"/>
                     <a:stretch>
                       <a:fillRect/>
                     </a:stretch>
@@ -10455,8 +10586,8 @@
         <w:t xml:space="preserve">).</w:t>
       </w:r>
     </w:p>
-    <w:bookmarkEnd w:id="51"/>
-    <w:bookmarkStart w:id="55" w:name="per-patient-routing-behavior"/>
+    <w:bookmarkEnd w:id="47"/>
+    <w:bookmarkStart w:id="51" w:name="per-patient-routing-behavior"/>
     <w:p>
       <w:pPr>
         <w:pStyle w:val="Heading3"/>
@@ -10488,18 +10619,18 @@
           <wp:inline>
             <wp:extent cx="5334000" cy="4148666"/>
             <wp:effectExtent b="0" l="0" r="0" t="0"/>
-            <wp:docPr descr="Per-Patient Multimodal Gating Routing Weights. Heatmap showing individual patient routing weights (P_{tab}, P_{soft}, P_{hard}) across all N=46 subjects. Patients are grouped by subgroup (non-vapers vs. active vapers) to show the distinct routing patterns learned by the gating network." title="" id="53" name="Picture"/>
+            <wp:docPr descr="Per-Patient Multimodal Gating Routing Weights. Heatmap showing individual patient routing weights (P_{tab}, P_{soft}, P_{hard}) across all N=46 subjects. Patients are grouped by subgroup (non-vapers vs. active vapers) to show the distinct routing patterns learned by the gating network." title="" id="49" name="Picture"/>
             <a:graphic>
               <a:graphicData uri="http://schemas.openxmlformats.org/drawingml/2006/picture">
                 <pic:pic>
                   <pic:nvPicPr>
-                    <pic:cNvPr descr="figure3_routing_heatmap.png" id="54" name="Picture"/>
+                    <pic:cNvPr descr="figure3_routing_heatmap.png" id="50" name="Picture"/>
                     <pic:cNvPicPr>
                       <a:picLocks noChangeArrowheads="1" noChangeAspect="1"/>
                     </pic:cNvPicPr>
                   </pic:nvPicPr>
                   <pic:blipFill>
-                    <a:blip r:embed="rId52"/>
+                    <a:blip r:embed="rId48"/>
                     <a:stretch>
                       <a:fillRect/>
                     </a:stretch>
@@ -10704,7 +10835,7 @@
       <w:pPr>
         <w:numPr>
           <w:ilvl w:val="0"/>
-          <w:numId w:val="1009"/>
+          <w:numId w:val="1010"/>
         </w:numPr>
       </w:pPr>
       <w:r>
@@ -10828,7 +10959,7 @@
       <w:pPr>
         <w:numPr>
           <w:ilvl w:val="0"/>
-          <w:numId w:val="1009"/>
+          <w:numId w:val="1010"/>
         </w:numPr>
       </w:pPr>
       <w:r>
@@ -10937,7 +11068,7 @@
       <w:pPr>
         <w:numPr>
           <w:ilvl w:val="0"/>
-          <w:numId w:val="1009"/>
+          <w:numId w:val="1010"/>
         </w:numPr>
       </w:pPr>
       <w:r>
@@ -11148,8 +11279,8 @@
         <w:t xml:space="preserve">severity spectrum rather than a hard vaper/non-vaper switch.</w:t>
       </w:r>
     </w:p>
-    <w:bookmarkEnd w:id="55"/>
-    <w:bookmarkStart w:id="56" w:name="modality-dismissal-analysis"/>
+    <w:bookmarkEnd w:id="51"/>
+    <w:bookmarkStart w:id="52" w:name="modality-dismissal-analysis"/>
     <w:p>
       <w:pPr>
         <w:pStyle w:val="Heading3"/>
@@ -11576,8 +11707,8 @@
         <w:t xml:space="preserve">zero-cell contingency tables.</w:t>
       </w:r>
     </w:p>
-    <w:bookmarkEnd w:id="56"/>
-    <w:bookmarkStart w:id="63" w:name="statistical-superiority-over-baselines"/>
+    <w:bookmarkEnd w:id="52"/>
+    <w:bookmarkStart w:id="59" w:name="statistical-superiority-over-baselines"/>
     <w:p>
       <w:pPr>
         <w:pStyle w:val="Heading3"/>
@@ -11802,18 +11933,18 @@
           <wp:inline>
             <wp:extent cx="5334000" cy="1491225"/>
             <wp:effectExtent b="0" l="0" r="0" t="0"/>
-            <wp:docPr descr="McNemar Case Study Panel. A table summarizing the clinical profiles and predictions of representative patients corrected by the CAF compared to the static baseline model. This illustrates the visual suppression of active vapers and correct visual routing of non-vapers." title="" id="58" name="Picture"/>
+            <wp:docPr descr="McNemar Case Study Panel. A table summarizing the clinical profiles and predictions of representative patients corrected by the CAF compared to the static baseline model. This illustrates the visual suppression of active vapers and correct visual routing of non-vapers." title="" id="54" name="Picture"/>
             <a:graphic>
               <a:graphicData uri="http://schemas.openxmlformats.org/drawingml/2006/picture">
                 <pic:pic>
                   <pic:nvPicPr>
-                    <pic:cNvPr descr="figure9_mcnemar_cases.png" id="59" name="Picture"/>
+                    <pic:cNvPr descr="figure9_mcnemar_cases.png" id="55" name="Picture"/>
                     <pic:cNvPicPr>
                       <a:picLocks noChangeArrowheads="1" noChangeAspect="1"/>
                     </pic:cNvPicPr>
                   </pic:nvPicPr>
                   <pic:blipFill>
-                    <a:blip r:embed="rId57"/>
+                    <a:blip r:embed="rId53"/>
                     <a:stretch>
                       <a:fillRect/>
                     </a:stretch>
@@ -11912,7 +12043,7 @@
       <w:pPr>
         <w:numPr>
           <w:ilvl w:val="0"/>
-          <w:numId w:val="1010"/>
+          <w:numId w:val="1011"/>
         </w:numPr>
       </w:pPr>
       <w:r>
@@ -11923,7 +12054,7 @@
       <w:pPr>
         <w:numPr>
           <w:ilvl w:val="0"/>
-          <w:numId w:val="1010"/>
+          <w:numId w:val="1011"/>
         </w:numPr>
       </w:pPr>
       <w:r>
@@ -11934,7 +12065,7 @@
       <w:pPr>
         <w:numPr>
           <w:ilvl w:val="0"/>
-          <w:numId w:val="1010"/>
+          <w:numId w:val="1011"/>
         </w:numPr>
       </w:pPr>
       <w:r>
@@ -12041,7 +12172,7 @@
       <w:pPr>
         <w:numPr>
           <w:ilvl w:val="0"/>
-          <w:numId w:val="1011"/>
+          <w:numId w:val="1012"/>
         </w:numPr>
       </w:pPr>
       <w:r>
@@ -12117,7 +12248,7 @@
       <w:pPr>
         <w:numPr>
           <w:ilvl w:val="0"/>
-          <w:numId w:val="1011"/>
+          <w:numId w:val="1012"/>
         </w:numPr>
       </w:pPr>
       <w:r>
@@ -12224,18 +12355,18 @@
           <wp:inline>
             <wp:extent cx="5334000" cy="2262364"/>
             <wp:effectExtent b="0" l="0" r="0" t="0"/>
-            <wp:docPr descr="Receiver Operating Characteristic (ROC) and Precision-Recall (PR) Curves. Benchmarking curves comparing the Clinical Attention Framework (CAF) with unimodal baselines and standard multimodal fusion strategies (Late Concatenation, GMU, and Bilinear Fusion) under leave-one-out cross-validation (LOOCV)." title="" id="61" name="Picture"/>
+            <wp:docPr descr="Receiver Operating Characteristic (ROC) and Precision-Recall (PR) Curves. Benchmarking curves comparing the Clinical Attention Framework (CAF) with unimodal baselines and standard multimodal fusion strategies (Late Concatenation, GMU, and Bilinear Fusion) under leave-one-out cross-validation (LOOCV)." title="" id="57" name="Picture"/>
             <a:graphic>
               <a:graphicData uri="http://schemas.openxmlformats.org/drawingml/2006/picture">
                 <pic:pic>
                   <pic:nvPicPr>
-                    <pic:cNvPr descr="figure4_roc_pr_curves.png" id="62" name="Picture"/>
+                    <pic:cNvPr descr="figure4_roc_pr_curves.png" id="58" name="Picture"/>
                     <pic:cNvPicPr>
                       <a:picLocks noChangeArrowheads="1" noChangeAspect="1"/>
                     </pic:cNvPicPr>
                   </pic:nvPicPr>
                   <pic:blipFill>
-                    <a:blip r:embed="rId60"/>
+                    <a:blip r:embed="rId56"/>
                     <a:stretch>
                       <a:fillRect/>
                     </a:stretch>
@@ -12344,9 +12475,9 @@
         <w:t xml:space="preserve">cross-validation (LOOCV).</w:t>
       </w:r>
     </w:p>
-    <w:bookmarkEnd w:id="63"/>
-    <w:bookmarkEnd w:id="64"/>
-    <w:bookmarkStart w:id="83" w:name="discussion"/>
+    <w:bookmarkEnd w:id="59"/>
+    <w:bookmarkEnd w:id="60"/>
+    <w:bookmarkStart w:id="79" w:name="discussion"/>
     <w:p>
       <w:pPr>
         <w:pStyle w:val="Heading2"/>
@@ -12359,7 +12490,7 @@
         <w:t xml:space="preserve">4. Discussion</w:t>
       </w:r>
     </w:p>
-    <w:bookmarkStart w:id="68" w:name="X65089300cc5a1e33d1d169f103ee9f5a6087412"/>
+    <w:bookmarkStart w:id="64" w:name="X65089300cc5a1e33d1d169f103ee9f5a6087412"/>
     <w:p>
       <w:pPr>
         <w:pStyle w:val="Heading3"/>
@@ -13634,18 +13765,18 @@
           <wp:inline>
             <wp:extent cx="5334000" cy="3007087"/>
             <wp:effectExtent b="0" l="0" r="0" t="0"/>
-            <wp:docPr descr="Multimodal Feature Contamination Mechanism. Flowchart illustrating how a static fusion model is contaminated by misleading visual signals (erythema/swelling masked by nicotine vasoconstriction), leading to diagnostic errors, and how the CAF’s exogenous context gate resolves this conflict." title="" id="66" name="Picture"/>
+            <wp:docPr descr="Multimodal Feature Contamination Mechanism. Flowchart illustrating how a static fusion model is contaminated by misleading visual signals (erythema/swelling masked by nicotine vasoconstriction), leading to diagnostic errors, and how the CAF’s exogenous context gate resolves this conflict." title="" id="62" name="Picture"/>
             <a:graphic>
               <a:graphicData uri="http://schemas.openxmlformats.org/drawingml/2006/picture">
                 <pic:pic>
                   <pic:nvPicPr>
-                    <pic:cNvPr descr="figure7_contamination.png" id="67" name="Picture"/>
+                    <pic:cNvPr descr="figure7_contamination.png" id="63" name="Picture"/>
                     <pic:cNvPicPr>
                       <a:picLocks noChangeArrowheads="1" noChangeAspect="1"/>
                     </pic:cNvPicPr>
                   </pic:nvPicPr>
                   <pic:blipFill>
-                    <a:blip r:embed="rId65"/>
+                    <a:blip r:embed="rId61"/>
                     <a:stretch>
                       <a:fillRect/>
                     </a:stretch>
@@ -14067,8 +14198,8 @@
         <w:t xml:space="preserve">exams.</w:t>
       </w:r>
     </w:p>
-    <w:bookmarkEnd w:id="68"/>
-    <w:bookmarkStart w:id="72" w:name="X0b4b9617d3713fb681d2b71d1d91969f40eb3cc"/>
+    <w:bookmarkEnd w:id="64"/>
+    <w:bookmarkStart w:id="68" w:name="X0b4b9617d3713fb681d2b71d1d91969f40eb3cc"/>
     <w:p>
       <w:pPr>
         <w:pStyle w:val="Heading3"/>
@@ -14602,18 +14733,18 @@
           <wp:inline>
             <wp:extent cx="5334000" cy="4000499"/>
             <wp:effectExtent b="0" l="0" r="0" t="0"/>
-            <wp:docPr descr="Dose-Response Attention Routing vs. Nicotine Exposure. Scatter plot showing the correlation between patient nicotine exposure intensity and the soft-tissue photo attention weight (P_{soft}). Active vapers (red triangles) show a clear suppression of visual trust as exposure increases, while non-vapers (blue circles) maintain high visual trust." title="" id="70" name="Picture"/>
+            <wp:docPr descr="Dose-Response Attention Routing vs. Nicotine Exposure. Scatter plot showing the correlation between patient nicotine exposure intensity and the soft-tissue photo attention weight (P_{soft}). Active vapers (red triangles) show a clear suppression of visual trust as exposure increases, while non-vapers (blue circles) maintain high visual trust." title="" id="66" name="Picture"/>
             <a:graphic>
               <a:graphicData uri="http://schemas.openxmlformats.org/drawingml/2006/picture">
                 <pic:pic>
                   <pic:nvPicPr>
-                    <pic:cNvPr descr="figure8_dose_response.png" id="71" name="Picture"/>
+                    <pic:cNvPr descr="figure8_dose_response.png" id="67" name="Picture"/>
                     <pic:cNvPicPr>
                       <a:picLocks noChangeArrowheads="1" noChangeAspect="1"/>
                     </pic:cNvPicPr>
                   </pic:nvPicPr>
                   <pic:blipFill>
-                    <a:blip r:embed="rId69"/>
+                    <a:blip r:embed="rId65"/>
                     <a:stretch>
                       <a:fillRect/>
                     </a:stretch>
@@ -14746,8 +14877,8 @@
         <w:t xml:space="preserve">increases, while non-vapers (blue circles) maintain high visual trust.</w:t>
       </w:r>
     </w:p>
-    <w:bookmarkEnd w:id="72"/>
-    <w:bookmarkStart w:id="79" w:name="X37567be7b079f09bc158eec1094810e8e7206eb"/>
+    <w:bookmarkEnd w:id="68"/>
+    <w:bookmarkStart w:id="75" w:name="X37567be7b079f09bc158eec1094810e8e7206eb"/>
     <w:p>
       <w:pPr>
         <w:pStyle w:val="Heading3"/>
@@ -15340,7 +15471,7 @@
       <w:pPr>
         <w:numPr>
           <w:ilvl w:val="0"/>
-          <w:numId w:val="1012"/>
+          <w:numId w:val="1013"/>
         </w:numPr>
       </w:pPr>
       <w:r>
@@ -15574,7 +15705,7 @@
       <w:pPr>
         <w:numPr>
           <w:ilvl w:val="0"/>
-          <w:numId w:val="1012"/>
+          <w:numId w:val="1013"/>
         </w:numPr>
       </w:pPr>
       <w:r>
@@ -15838,7 +15969,7 @@
       <w:pPr>
         <w:numPr>
           <w:ilvl w:val="0"/>
-          <w:numId w:val="1012"/>
+          <w:numId w:val="1013"/>
         </w:numPr>
       </w:pPr>
       <w:r>
@@ -16014,18 +16145,18 @@
           <wp:inline>
             <wp:extent cx="5334000" cy="2297080"/>
             <wp:effectExtent b="0" l="0" r="0" t="0"/>
-            <wp:docPr descr="Principal Component Analysis (PCA) Gated Projection. Projection of the final fused modality scores under the dynamic gating system (CAF) vs. static late concatenation. This visualizes how the dynamic gating network resolves conflicting signals by aligning patients along clinical clusters." title="" id="74" name="Picture"/>
+            <wp:docPr descr="Principal Component Analysis (PCA) Gated Projection. Projection of the final fused modality scores under the dynamic gating system (CAF) vs. static late concatenation. This visualizes how the dynamic gating network resolves conflicting signals by aligning patients along clinical clusters." title="" id="70" name="Picture"/>
             <a:graphic>
               <a:graphicData uri="http://schemas.openxmlformats.org/drawingml/2006/picture">
                 <pic:pic>
                   <pic:nvPicPr>
-                    <pic:cNvPr descr="figure6_gated_projection.png" id="75" name="Picture"/>
+                    <pic:cNvPr descr="figure6_gated_projection.png" id="71" name="Picture"/>
                     <pic:cNvPicPr>
                       <a:picLocks noChangeArrowheads="1" noChangeAspect="1"/>
                     </pic:cNvPicPr>
                   </pic:nvPicPr>
                   <pic:blipFill>
-                    <a:blip r:embed="rId73"/>
+                    <a:blip r:embed="rId69"/>
                     <a:stretch>
                       <a:fillRect/>
                     </a:stretch>
@@ -16135,18 +16266,18 @@
           <wp:inline>
             <wp:extent cx="5334000" cy="4267199"/>
             <wp:effectExtent b="0" l="0" r="0" t="0"/>
-            <wp:docPr descr="Learned Gating Weight Matrix (W_{gating}) Heatmap. Connection weights mapping patient vaping features (Frequency, Duration, Nicotine) to output modalities (P_{tab}, P_{soft}, P_{hard}). Values represent the ensembled weights averaged over 420 LOOCV runs." title="" id="77" name="Picture"/>
+            <wp:docPr descr="Learned Gating Weight Matrix (W_{gating}) Heatmap. Connection weights mapping patient vaping features (Frequency, Duration, Nicotine) to output modalities (P_{tab}, P_{soft}, P_{hard}). Values represent the ensembled weights averaged over 420 LOOCV runs." title="" id="73" name="Picture"/>
             <a:graphic>
               <a:graphicData uri="http://schemas.openxmlformats.org/drawingml/2006/picture">
                 <pic:pic>
                   <pic:nvPicPr>
-                    <pic:cNvPr descr="figure10_w_gate_heatmap.png" id="78" name="Picture"/>
+                    <pic:cNvPr descr="figure10_w_gate_heatmap.png" id="74" name="Picture"/>
                     <pic:cNvPicPr>
                       <a:picLocks noChangeArrowheads="1" noChangeAspect="1"/>
                     </pic:cNvPicPr>
                   </pic:nvPicPr>
                   <pic:blipFill>
-                    <a:blip r:embed="rId76"/>
+                    <a:blip r:embed="rId72"/>
                     <a:stretch>
                       <a:fillRect/>
                     </a:stretch>
@@ -16354,8 +16485,8 @@
         <w:t xml:space="preserve">ensembled weights averaged over 420 LOOCV runs.</w:t>
       </w:r>
     </w:p>
-    <w:bookmarkEnd w:id="79"/>
-    <w:bookmarkStart w:id="80" w:name="X7feba729cb2500144c46823a04539fb7f517f51"/>
+    <w:bookmarkEnd w:id="75"/>
+    <w:bookmarkStart w:id="76" w:name="X7feba729cb2500144c46823a04539fb7f517f51"/>
     <w:p>
       <w:pPr>
         <w:pStyle w:val="Heading3"/>
@@ -16671,8 +16802,8 @@
         <w:t xml:space="preserve">encoders.</w:t>
       </w:r>
     </w:p>
-    <w:bookmarkEnd w:id="80"/>
-    <w:bookmarkStart w:id="81" w:name="limitations"/>
+    <w:bookmarkEnd w:id="76"/>
+    <w:bookmarkStart w:id="77" w:name="limitations"/>
     <w:p>
       <w:pPr>
         <w:pStyle w:val="Heading3"/>
@@ -16703,7 +16834,7 @@
       <w:pPr>
         <w:numPr>
           <w:ilvl w:val="0"/>
-          <w:numId w:val="1013"/>
+          <w:numId w:val="1014"/>
         </w:numPr>
       </w:pPr>
       <w:r>
@@ -16770,7 +16901,7 @@
       <w:pPr>
         <w:numPr>
           <w:ilvl w:val="0"/>
-          <w:numId w:val="1013"/>
+          <w:numId w:val="1014"/>
         </w:numPr>
       </w:pPr>
       <w:r>
@@ -16826,7 +16957,7 @@
       <w:pPr>
         <w:numPr>
           <w:ilvl w:val="0"/>
-          <w:numId w:val="1013"/>
+          <w:numId w:val="1014"/>
         </w:numPr>
       </w:pPr>
       <w:r>
@@ -16910,7 +17041,7 @@
       <w:pPr>
         <w:numPr>
           <w:ilvl w:val="0"/>
-          <w:numId w:val="1013"/>
+          <w:numId w:val="1014"/>
         </w:numPr>
       </w:pPr>
       <w:r>
@@ -16949,7 +17080,7 @@
       <w:pPr>
         <w:numPr>
           <w:ilvl w:val="0"/>
-          <w:numId w:val="1013"/>
+          <w:numId w:val="1014"/>
         </w:numPr>
       </w:pPr>
       <w:r>
@@ -17016,7 +17147,7 @@
       <w:pPr>
         <w:numPr>
           <w:ilvl w:val="0"/>
-          <w:numId w:val="1013"/>
+          <w:numId w:val="1014"/>
         </w:numPr>
       </w:pPr>
       <w:r>
@@ -17069,8 +17200,8 @@
         <w:t xml:space="preserve">should validate by comparing constrained and unconstrained variants.</w:t>
       </w:r>
     </w:p>
-    <w:bookmarkEnd w:id="81"/>
-    <w:bookmarkStart w:id="82" w:name="future-work-and-scalability-blueprint"/>
+    <w:bookmarkEnd w:id="77"/>
+    <w:bookmarkStart w:id="78" w:name="future-work-and-scalability-blueprint"/>
     <w:p>
       <w:pPr>
         <w:pStyle w:val="Heading3"/>
@@ -17101,7 +17232,7 @@
       <w:pPr>
         <w:numPr>
           <w:ilvl w:val="0"/>
-          <w:numId w:val="1014"/>
+          <w:numId w:val="1015"/>
         </w:numPr>
       </w:pPr>
       <w:r>
@@ -17289,7 +17420,7 @@
       <w:pPr>
         <w:numPr>
           <w:ilvl w:val="0"/>
-          <w:numId w:val="1014"/>
+          <w:numId w:val="1015"/>
         </w:numPr>
       </w:pPr>
       <w:r>
@@ -17352,7 +17483,7 @@
       <w:pPr>
         <w:numPr>
           <w:ilvl w:val="0"/>
-          <w:numId w:val="1014"/>
+          <w:numId w:val="1015"/>
         </w:numPr>
       </w:pPr>
       <w:r>
@@ -17391,7 +17522,7 @@
       <w:pPr>
         <w:numPr>
           <w:ilvl w:val="0"/>
-          <w:numId w:val="1014"/>
+          <w:numId w:val="1015"/>
         </w:numPr>
       </w:pPr>
       <w:r>
@@ -17424,7 +17555,7 @@
       <w:pPr>
         <w:numPr>
           <w:ilvl w:val="0"/>
-          <w:numId w:val="1014"/>
+          <w:numId w:val="1015"/>
         </w:numPr>
       </w:pPr>
       <w:r>
@@ -17459,9 +17590,9 @@
         <w:t xml:space="preserve">photographs, treating image quality as a physical confounder.</w:t>
       </w:r>
     </w:p>
-    <w:bookmarkEnd w:id="82"/>
-    <w:bookmarkEnd w:id="83"/>
-    <w:bookmarkStart w:id="107" w:name="conclusion"/>
+    <w:bookmarkEnd w:id="78"/>
+    <w:bookmarkEnd w:id="79"/>
+    <w:bookmarkStart w:id="103" w:name="conclusion"/>
     <w:p>
       <w:pPr>
         <w:pStyle w:val="Heading2"/>
@@ -17848,18 +17979,18 @@
           <wp:inline>
             <wp:extent cx="5334000" cy="3765176"/>
             <wp:effectExtent b="0" l="0" r="0" t="0"/>
-            <wp:docPr descr="Gating Network Training Loss Convergence Curves. Convergence envelope of the Binary Cross-Entropy loss across all 420 LOOCV runs, displaying the mean curve, \pm 1 standard deviation band, min-max bounds, and representative individual trajectories." title="" id="85" name="Picture"/>
+            <wp:docPr descr="Gating Network Training Loss Convergence Curves. Convergence envelope of the Binary Cross-Entropy loss across all 420 LOOCV runs, displaying the mean curve, \pm 1 standard deviation band, min-max bounds, and representative individual trajectories." title="" id="81" name="Picture"/>
             <a:graphic>
               <a:graphicData uri="http://schemas.openxmlformats.org/drawingml/2006/picture">
                 <pic:pic>
                   <pic:nvPicPr>
-                    <pic:cNvPr descr="figure11_loss_convergence.png" id="86" name="Picture"/>
+                    <pic:cNvPr descr="figure11_loss_convergence.png" id="82" name="Picture"/>
                     <pic:cNvPicPr>
                       <a:picLocks noChangeArrowheads="1" noChangeAspect="1"/>
                     </pic:cNvPicPr>
                   </pic:nvPicPr>
                   <pic:blipFill>
-                    <a:blip r:embed="rId84"/>
+                    <a:blip r:embed="rId80"/>
                     <a:stretch>
                       <a:fillRect/>
                     </a:stretch>
@@ -18270,7 +18401,7 @@
       <w:r>
         <w:t xml:space="preserve"> </w:t>
       </w:r>
-      <w:hyperlink r:id="rId87">
+      <w:hyperlink r:id="rId83">
         <w:r>
           <w:rPr>
             <w:rStyle w:val="Hyperlink"/>
@@ -18295,7 +18426,7 @@
       <w:r>
         <w:t xml:space="preserve"> </w:t>
       </w:r>
-      <w:hyperlink r:id="rId88">
+      <w:hyperlink r:id="rId84">
         <w:r>
           <w:rPr>
             <w:rStyle w:val="Hyperlink"/>
@@ -18326,7 +18457,7 @@
       <w:r>
         <w:t xml:space="preserve"> </w:t>
       </w:r>
-      <w:hyperlink r:id="rId89">
+      <w:hyperlink r:id="rId85">
         <w:r>
           <w:rPr>
             <w:rStyle w:val="Hyperlink"/>
@@ -18363,7 +18494,7 @@
       <w:r>
         <w:t xml:space="preserve"> </w:t>
       </w:r>
-      <w:hyperlink r:id="rId90">
+      <w:hyperlink r:id="rId86">
         <w:r>
           <w:rPr>
             <w:rStyle w:val="Hyperlink"/>
@@ -18394,7 +18525,7 @@
       <w:r>
         <w:t xml:space="preserve"> </w:t>
       </w:r>
-      <w:hyperlink r:id="rId91">
+      <w:hyperlink r:id="rId87">
         <w:r>
           <w:rPr>
             <w:rStyle w:val="Hyperlink"/>
@@ -18431,7 +18562,7 @@
       <w:r>
         <w:t xml:space="preserve"> </w:t>
       </w:r>
-      <w:hyperlink r:id="rId92">
+      <w:hyperlink r:id="rId88">
         <w:r>
           <w:rPr>
             <w:rStyle w:val="Hyperlink"/>
@@ -18462,7 +18593,7 @@
       <w:r>
         <w:t xml:space="preserve"> </w:t>
       </w:r>
-      <w:hyperlink r:id="rId93">
+      <w:hyperlink r:id="rId89">
         <w:r>
           <w:rPr>
             <w:rStyle w:val="Hyperlink"/>
@@ -18493,7 +18624,7 @@
       <w:r>
         <w:t xml:space="preserve"> </w:t>
       </w:r>
-      <w:hyperlink r:id="rId94">
+      <w:hyperlink r:id="rId90">
         <w:r>
           <w:rPr>
             <w:rStyle w:val="Hyperlink"/>
@@ -18532,7 +18663,7 @@
       <w:r>
         <w:t xml:space="preserve"> </w:t>
       </w:r>
-      <w:hyperlink r:id="rId95">
+      <w:hyperlink r:id="rId91">
         <w:r>
           <w:rPr>
             <w:rStyle w:val="Hyperlink"/>
@@ -18629,7 +18760,7 @@
       <w:r>
         <w:t xml:space="preserve"> </w:t>
       </w:r>
-      <w:hyperlink r:id="rId96">
+      <w:hyperlink r:id="rId92">
         <w:r>
           <w:rPr>
             <w:rStyle w:val="Hyperlink"/>
@@ -18660,7 +18791,7 @@
       <w:r>
         <w:t xml:space="preserve"> </w:t>
       </w:r>
-      <w:hyperlink r:id="rId97">
+      <w:hyperlink r:id="rId93">
         <w:r>
           <w:rPr>
             <w:rStyle w:val="Hyperlink"/>
@@ -18741,7 +18872,7 @@
       <w:r>
         <w:t xml:space="preserve"> </w:t>
       </w:r>
-      <w:hyperlink r:id="rId98">
+      <w:hyperlink r:id="rId94">
         <w:r>
           <w:rPr>
             <w:rStyle w:val="Hyperlink"/>
@@ -18798,7 +18929,7 @@
       <w:r>
         <w:t xml:space="preserve"> </w:t>
       </w:r>
-      <w:hyperlink r:id="rId99">
+      <w:hyperlink r:id="rId95">
         <w:r>
           <w:rPr>
             <w:rStyle w:val="Hyperlink"/>
@@ -18844,7 +18975,7 @@
       <w:r>
         <w:t xml:space="preserve"> </w:t>
       </w:r>
-      <w:hyperlink r:id="rId100">
+      <w:hyperlink r:id="rId96">
         <w:r>
           <w:rPr>
             <w:rStyle w:val="Hyperlink"/>
@@ -18875,7 +19006,7 @@
       <w:r>
         <w:t xml:space="preserve"> </w:t>
       </w:r>
-      <w:hyperlink r:id="rId101">
+      <w:hyperlink r:id="rId97">
         <w:r>
           <w:rPr>
             <w:rStyle w:val="Hyperlink"/>
@@ -18900,7 +19031,7 @@
       <w:r>
         <w:t xml:space="preserve"> </w:t>
       </w:r>
-      <w:hyperlink r:id="rId102">
+      <w:hyperlink r:id="rId98">
         <w:r>
           <w:rPr>
             <w:rStyle w:val="Hyperlink"/>
@@ -18951,7 +19082,7 @@
       <w:r>
         <w:t xml:space="preserve"> </w:t>
       </w:r>
-      <w:hyperlink r:id="rId103">
+      <w:hyperlink r:id="rId99">
         <w:r>
           <w:rPr>
             <w:rStyle w:val="Hyperlink"/>
@@ -19032,7 +19163,7 @@
       <w:r>
         <w:t xml:space="preserve"> </w:t>
       </w:r>
-      <w:hyperlink r:id="rId104">
+      <w:hyperlink r:id="rId100">
         <w:r>
           <w:rPr>
             <w:rStyle w:val="Hyperlink"/>
@@ -19057,7 +19188,7 @@
       <w:r>
         <w:t xml:space="preserve"> </w:t>
       </w:r>
-      <w:hyperlink r:id="rId105">
+      <w:hyperlink r:id="rId101">
         <w:r>
           <w:rPr>
             <w:rStyle w:val="Hyperlink"/>
@@ -19088,7 +19219,7 @@
       <w:r>
         <w:t xml:space="preserve"> </w:t>
       </w:r>
-      <w:hyperlink r:id="rId106">
+      <w:hyperlink r:id="rId102">
         <w:r>
           <w:rPr>
             <w:rStyle w:val="Hyperlink"/>
@@ -19123,8 +19254,8 @@
         <w:t xml:space="preserve">Processing (pp. 1103–1114). Association for Computational Linguistics.</w:t>
       </w:r>
     </w:p>
-    <w:bookmarkEnd w:id="107"/>
-    <w:bookmarkEnd w:id="108"/>
+    <w:bookmarkEnd w:id="103"/>
+    <w:bookmarkEnd w:id="104"/>
     <w:sectPr>
       <w:footnotePr>
         <w:numRestart w:val="eachSect"/>
@@ -19235,6 +19366,109 @@
       </w:pPr>
     </w:lvl>
   </w:abstractNum>
+  <w:abstractNum w:abstractNumId="991">
+    <w:nsid w:val="0000A991"/>
+    <w:multiLevelType w:val="multilevel"/>
+    <w:lvl w:ilvl="0">
+      <w:numFmt w:val="bullet"/>
+      <w:lvlText w:val=""/>
+      <w:lvlJc w:val="left"/>
+      <w:pPr>
+        <w:ind w:left="720" w:hanging="360"/>
+      </w:pPr>
+      <w:rPr>
+        <w:rFonts w:ascii="Symbol" w:hAnsi="Symbol" w:cs="Symbol" w:hint="default"/>
+      </w:rPr>
+    </w:lvl>
+    <w:lvl w:ilvl="1">
+      <w:numFmt w:val="bullet"/>
+      <w:lvlText w:val="o"/>
+      <w:lvlJc w:val="left"/>
+      <w:pPr>
+        <w:ind w:left="1440" w:hanging="360"/>
+      </w:pPr>
+      <w:rPr>
+        <w:rFonts w:ascii="Courier New" w:hAnsi="Courier New" w:cs="Courier New" w:hint="default"/>
+      </w:rPr>
+    </w:lvl>
+    <w:lvl w:ilvl="2">
+      <w:numFmt w:val="bullet"/>
+      <w:lvlText w:val=""/>
+      <w:lvlJc w:val="left"/>
+      <w:pPr>
+        <w:ind w:left="2160" w:hanging="360"/>
+      </w:pPr>
+      <w:rPr>
+        <w:rFonts w:ascii="Wingdings" w:hAnsi="Wingdings" w:cs="Wingdings" w:hint="default"/>
+      </w:rPr>
+    </w:lvl>
+    <w:lvl w:ilvl="3">
+      <w:numFmt w:val="bullet"/>
+      <w:lvlText w:val=""/>
+      <w:lvlJc w:val="left"/>
+      <w:pPr>
+        <w:ind w:left="2880" w:hanging="360"/>
+      </w:pPr>
+      <w:rPr>
+        <w:rFonts w:ascii="Symbol" w:hAnsi="Symbol" w:cs="Symbol" w:hint="default"/>
+      </w:rPr>
+    </w:lvl>
+    <w:lvl w:ilvl="4">
+      <w:numFmt w:val="bullet"/>
+      <w:lvlText w:val="o"/>
+      <w:lvlJc w:val="left"/>
+      <w:pPr>
+        <w:ind w:left="3600" w:hanging="360"/>
+      </w:pPr>
+      <w:rPr>
+        <w:rFonts w:ascii="Courier New" w:hAnsi="Courier New" w:cs="Courier New" w:hint="default"/>
+      </w:rPr>
+    </w:lvl>
+    <w:lvl w:ilvl="5">
+      <w:numFmt w:val="bullet"/>
+      <w:lvlText w:val=""/>
+      <w:lvlJc w:val="left"/>
+      <w:pPr>
+        <w:ind w:left="4320" w:hanging="360"/>
+      </w:pPr>
+      <w:rPr>
+        <w:rFonts w:ascii="Wingdings" w:hAnsi="Wingdings" w:cs="Wingdings" w:hint="default"/>
+      </w:rPr>
+    </w:lvl>
+    <w:lvl w:ilvl="6">
+      <w:numFmt w:val="bullet"/>
+      <w:lvlText w:val=""/>
+      <w:lvlJc w:val="left"/>
+      <w:pPr>
+        <w:ind w:left="5040" w:hanging="360"/>
+      </w:pPr>
+      <w:rPr>
+        <w:rFonts w:ascii="Symbol" w:hAnsi="Symbol" w:cs="Symbol" w:hint="default"/>
+      </w:rPr>
+    </w:lvl>
+    <w:lvl w:ilvl="7">
+      <w:numFmt w:val="bullet"/>
+      <w:lvlText w:val="o"/>
+      <w:lvlJc w:val="left"/>
+      <w:pPr>
+        <w:ind w:left="5760" w:hanging="360"/>
+      </w:pPr>
+      <w:rPr>
+        <w:rFonts w:ascii="Courier New" w:hAnsi="Courier New" w:cs="Courier New" w:hint="default"/>
+      </w:rPr>
+    </w:lvl>
+    <w:lvl w:ilvl="8">
+      <w:numFmt w:val="bullet"/>
+      <w:lvlText w:val=""/>
+      <w:lvlJc w:val="left"/>
+      <w:pPr>
+        <w:ind w:left="6480" w:hanging="360"/>
+      </w:pPr>
+      <w:rPr>
+        <w:rFonts w:ascii="Wingdings" w:hAnsi="Wingdings" w:cs="Wingdings" w:hint="default"/>
+      </w:rPr>
+    </w:lvl>
+  </w:abstractNum>
   <w:abstractNum w:abstractNumId="99411">
     <w:nsid w:val="00A99411"/>
     <w:multiLevelType w:val="multilevel"/>
@@ -19318,109 +19552,6 @@
       <w:pPr>
         <w:ind w:left="6480" w:hanging="360"/>
       </w:pPr>
-    </w:lvl>
-  </w:abstractNum>
-  <w:abstractNum w:abstractNumId="991">
-    <w:nsid w:val="0000A991"/>
-    <w:multiLevelType w:val="multilevel"/>
-    <w:lvl w:ilvl="0">
-      <w:numFmt w:val="bullet"/>
-      <w:lvlText w:val=""/>
-      <w:lvlJc w:val="left"/>
-      <w:pPr>
-        <w:ind w:left="720" w:hanging="360"/>
-      </w:pPr>
-      <w:rPr>
-        <w:rFonts w:ascii="Symbol" w:hAnsi="Symbol" w:cs="Symbol" w:hint="default"/>
-      </w:rPr>
-    </w:lvl>
-    <w:lvl w:ilvl="1">
-      <w:numFmt w:val="bullet"/>
-      <w:lvlText w:val="o"/>
-      <w:lvlJc w:val="left"/>
-      <w:pPr>
-        <w:ind w:left="1440" w:hanging="360"/>
-      </w:pPr>
-      <w:rPr>
-        <w:rFonts w:ascii="Courier New" w:hAnsi="Courier New" w:cs="Courier New" w:hint="default"/>
-      </w:rPr>
-    </w:lvl>
-    <w:lvl w:ilvl="2">
-      <w:numFmt w:val="bullet"/>
-      <w:lvlText w:val=""/>
-      <w:lvlJc w:val="left"/>
-      <w:pPr>
-        <w:ind w:left="2160" w:hanging="360"/>
-      </w:pPr>
-      <w:rPr>
-        <w:rFonts w:ascii="Wingdings" w:hAnsi="Wingdings" w:cs="Wingdings" w:hint="default"/>
-      </w:rPr>
-    </w:lvl>
-    <w:lvl w:ilvl="3">
-      <w:numFmt w:val="bullet"/>
-      <w:lvlText w:val=""/>
-      <w:lvlJc w:val="left"/>
-      <w:pPr>
-        <w:ind w:left="2880" w:hanging="360"/>
-      </w:pPr>
-      <w:rPr>
-        <w:rFonts w:ascii="Symbol" w:hAnsi="Symbol" w:cs="Symbol" w:hint="default"/>
-      </w:rPr>
-    </w:lvl>
-    <w:lvl w:ilvl="4">
-      <w:numFmt w:val="bullet"/>
-      <w:lvlText w:val="o"/>
-      <w:lvlJc w:val="left"/>
-      <w:pPr>
-        <w:ind w:left="3600" w:hanging="360"/>
-      </w:pPr>
-      <w:rPr>
-        <w:rFonts w:ascii="Courier New" w:hAnsi="Courier New" w:cs="Courier New" w:hint="default"/>
-      </w:rPr>
-    </w:lvl>
-    <w:lvl w:ilvl="5">
-      <w:numFmt w:val="bullet"/>
-      <w:lvlText w:val=""/>
-      <w:lvlJc w:val="left"/>
-      <w:pPr>
-        <w:ind w:left="4320" w:hanging="360"/>
-      </w:pPr>
-      <w:rPr>
-        <w:rFonts w:ascii="Wingdings" w:hAnsi="Wingdings" w:cs="Wingdings" w:hint="default"/>
-      </w:rPr>
-    </w:lvl>
-    <w:lvl w:ilvl="6">
-      <w:numFmt w:val="bullet"/>
-      <w:lvlText w:val=""/>
-      <w:lvlJc w:val="left"/>
-      <w:pPr>
-        <w:ind w:left="5040" w:hanging="360"/>
-      </w:pPr>
-      <w:rPr>
-        <w:rFonts w:ascii="Symbol" w:hAnsi="Symbol" w:cs="Symbol" w:hint="default"/>
-      </w:rPr>
-    </w:lvl>
-    <w:lvl w:ilvl="7">
-      <w:numFmt w:val="bullet"/>
-      <w:lvlText w:val="o"/>
-      <w:lvlJc w:val="left"/>
-      <w:pPr>
-        <w:ind w:left="5760" w:hanging="360"/>
-      </w:pPr>
-      <w:rPr>
-        <w:rFonts w:ascii="Courier New" w:hAnsi="Courier New" w:cs="Courier New" w:hint="default"/>
-      </w:rPr>
-    </w:lvl>
-    <w:lvl w:ilvl="8">
-      <w:numFmt w:val="bullet"/>
-      <w:lvlText w:val=""/>
-      <w:lvlJc w:val="left"/>
-      <w:pPr>
-        <w:ind w:left="6480" w:hanging="360"/>
-      </w:pPr>
-      <w:rPr>
-        <w:rFonts w:ascii="Wingdings" w:hAnsi="Wingdings" w:cs="Wingdings" w:hint="default"/>
-      </w:rPr>
     </w:lvl>
   </w:abstractNum>
   <w:abstractNum w:abstractNumId="99412">
@@ -19512,34 +19643,7 @@
     <w:abstractNumId w:val="990"/>
   </w:num>
   <w:num w:numId="1001">
-    <w:abstractNumId w:val="99411"/>
-    <w:lvlOverride w:ilvl="0">
-      <w:startOverride w:val="1"/>
-    </w:lvlOverride>
-    <w:lvlOverride w:ilvl="1">
-      <w:startOverride w:val="1"/>
-    </w:lvlOverride>
-    <w:lvlOverride w:ilvl="2">
-      <w:startOverride w:val="1"/>
-    </w:lvlOverride>
-    <w:lvlOverride w:ilvl="3">
-      <w:startOverride w:val="1"/>
-    </w:lvlOverride>
-    <w:lvlOverride w:ilvl="4">
-      <w:startOverride w:val="1"/>
-    </w:lvlOverride>
-    <w:lvlOverride w:ilvl="5">
-      <w:startOverride w:val="1"/>
-    </w:lvlOverride>
-    <w:lvlOverride w:ilvl="6">
-      <w:startOverride w:val="1"/>
-    </w:lvlOverride>
-    <w:lvlOverride w:ilvl="7">
-      <w:startOverride w:val="1"/>
-    </w:lvlOverride>
-    <w:lvlOverride w:ilvl="8">
-      <w:startOverride w:val="1"/>
-    </w:lvlOverride>
+    <w:abstractNumId w:val="991"/>
   </w:num>
   <w:num w:numId="1002">
     <w:abstractNumId w:val="99411"/>
@@ -19572,15 +19676,6 @@
     </w:lvlOverride>
   </w:num>
   <w:num w:numId="1003">
-    <w:abstractNumId w:val="991"/>
-  </w:num>
-  <w:num w:numId="1004">
-    <w:abstractNumId w:val="991"/>
-  </w:num>
-  <w:num w:numId="1005">
-    <w:abstractNumId w:val="991"/>
-  </w:num>
-  <w:num w:numId="1006">
     <w:abstractNumId w:val="99411"/>
     <w:lvlOverride w:ilvl="0">
       <w:startOverride w:val="1"/>
@@ -19610,10 +19705,16 @@
       <w:startOverride w:val="1"/>
     </w:lvlOverride>
   </w:num>
-  <w:num w:numId="1007">
+  <w:num w:numId="1004">
     <w:abstractNumId w:val="991"/>
   </w:num>
-  <w:num w:numId="1008">
+  <w:num w:numId="1005">
+    <w:abstractNumId w:val="991"/>
+  </w:num>
+  <w:num w:numId="1006">
+    <w:abstractNumId w:val="991"/>
+  </w:num>
+  <w:num w:numId="1007">
     <w:abstractNumId w:val="99411"/>
     <w:lvlOverride w:ilvl="0">
       <w:startOverride w:val="1"/>
@@ -19643,8 +19744,38 @@
       <w:startOverride w:val="1"/>
     </w:lvlOverride>
   </w:num>
+  <w:num w:numId="1008">
+    <w:abstractNumId w:val="991"/>
+  </w:num>
   <w:num w:numId="1009">
-    <w:abstractNumId w:val="991"/>
+    <w:abstractNumId w:val="99411"/>
+    <w:lvlOverride w:ilvl="0">
+      <w:startOverride w:val="1"/>
+    </w:lvlOverride>
+    <w:lvlOverride w:ilvl="1">
+      <w:startOverride w:val="1"/>
+    </w:lvlOverride>
+    <w:lvlOverride w:ilvl="2">
+      <w:startOverride w:val="1"/>
+    </w:lvlOverride>
+    <w:lvlOverride w:ilvl="3">
+      <w:startOverride w:val="1"/>
+    </w:lvlOverride>
+    <w:lvlOverride w:ilvl="4">
+      <w:startOverride w:val="1"/>
+    </w:lvlOverride>
+    <w:lvlOverride w:ilvl="5">
+      <w:startOverride w:val="1"/>
+    </w:lvlOverride>
+    <w:lvlOverride w:ilvl="6">
+      <w:startOverride w:val="1"/>
+    </w:lvlOverride>
+    <w:lvlOverride w:ilvl="7">
+      <w:startOverride w:val="1"/>
+    </w:lvlOverride>
+    <w:lvlOverride w:ilvl="8">
+      <w:startOverride w:val="1"/>
+    </w:lvlOverride>
   </w:num>
   <w:num w:numId="1010">
     <w:abstractNumId w:val="991"/>
@@ -19653,6 +19784,9 @@
     <w:abstractNumId w:val="991"/>
   </w:num>
   <w:num w:numId="1012">
+    <w:abstractNumId w:val="991"/>
+  </w:num>
+  <w:num w:numId="1013">
     <w:abstractNumId w:val="99412"/>
     <w:lvlOverride w:ilvl="0">
       <w:startOverride w:val="2"/>
@@ -19682,7 +19816,7 @@
       <w:startOverride w:val="2"/>
     </w:lvlOverride>
   </w:num>
-  <w:num w:numId="1013">
+  <w:num w:numId="1014">
     <w:abstractNumId w:val="99411"/>
     <w:lvlOverride w:ilvl="0">
       <w:startOverride w:val="1"/>
@@ -19712,7 +19846,7 @@
       <w:startOverride w:val="1"/>
     </w:lvlOverride>
   </w:num>
-  <w:num w:numId="1014">
+  <w:num w:numId="1015">
     <w:abstractNumId w:val="99411"/>
     <w:lvlOverride w:ilvl="0">
       <w:startOverride w:val="1"/>

</xml_diff>

<commit_message>
Fix escaped asterisks in evaluation metrics list to generate clean latex itemize list
</commit_message>
<xml_diff>
--- a/docs/manuscript.docx
+++ b/docs/manuscript.docx
@@ -6948,17 +6948,17 @@
         <w:pStyle w:val="FirstParagraph"/>
       </w:pPr>
       <w:r>
-        <w:t xml:space="preserve">To comprehensively benchmark diagnostic performance, we report the</w:t>
-      </w:r>
-      <w:r>
-        <w:t xml:space="preserve"> </w:t>
-      </w:r>
-      <w:r>
-        <w:t xml:space="preserve">following classification metrics: *</w:t>
-      </w:r>
-      <w:r>
-        <w:t xml:space="preserve"> </w:t>
-      </w:r>
+        <w:t xml:space="preserve">To comprehensively benchmark diagnostic performance, we report the following classification metrics:</w:t>
+      </w:r>
+    </w:p>
+    <w:p>
+      <w:pPr>
+        <w:pStyle w:val="Compact"/>
+        <w:numPr>
+          <w:ilvl w:val="0"/>
+          <w:numId w:val="1007"/>
+        </w:numPr>
+      </w:pPr>
       <w:r>
         <w:rPr>
           <w:b/>
@@ -6970,17 +6970,17 @@
         <w:t xml:space="preserve"> </w:t>
       </w:r>
       <w:r>
-        <w:t xml:space="preserve">The</w:t>
-      </w:r>
-      <w:r>
-        <w:t xml:space="preserve"> </w:t>
-      </w:r>
-      <w:r>
-        <w:t xml:space="preserve">percentage of correctly diagnosed patients. *</w:t>
-      </w:r>
-      <w:r>
-        <w:t xml:space="preserve"> </w:t>
-      </w:r>
+        <w:t xml:space="preserve">The percentage of correctly diagnosed patients.</w:t>
+      </w:r>
+    </w:p>
+    <w:p>
+      <w:pPr>
+        <w:pStyle w:val="Compact"/>
+        <w:numPr>
+          <w:ilvl w:val="0"/>
+          <w:numId w:val="1007"/>
+        </w:numPr>
+      </w:pPr>
       <w:r>
         <w:rPr>
           <w:b/>
@@ -6992,17 +6992,17 @@
         <w:t xml:space="preserve"> </w:t>
       </w:r>
       <w:r>
-        <w:t xml:space="preserve">The true positive rate, representing the proportion of periodontitis</w:t>
-      </w:r>
-      <w:r>
-        <w:t xml:space="preserve"> </w:t>
-      </w:r>
-      <w:r>
-        <w:t xml:space="preserve">patients successfully identified by the model. *</w:t>
-      </w:r>
-      <w:r>
-        <w:t xml:space="preserve"> </w:t>
-      </w:r>
+        <w:t xml:space="preserve">The true positive rate, representing the proportion of periodontitis patients successfully identified by the model.</w:t>
+      </w:r>
+    </w:p>
+    <w:p>
+      <w:pPr>
+        <w:pStyle w:val="Compact"/>
+        <w:numPr>
+          <w:ilvl w:val="0"/>
+          <w:numId w:val="1007"/>
+        </w:numPr>
+      </w:pPr>
       <w:r>
         <w:rPr>
           <w:b/>
@@ -7014,23 +7014,17 @@
         <w:t xml:space="preserve"> </w:t>
       </w:r>
       <w:r>
-        <w:t xml:space="preserve">The</w:t>
-      </w:r>
-      <w:r>
-        <w:t xml:space="preserve"> </w:t>
-      </w:r>
-      <w:r>
-        <w:t xml:space="preserve">true negative rate, representing the proportion of healthy subjects</w:t>
-      </w:r>
-      <w:r>
-        <w:t xml:space="preserve"> </w:t>
-      </w:r>
-      <w:r>
-        <w:t xml:space="preserve">correctly identified. *</w:t>
-      </w:r>
-      <w:r>
-        <w:t xml:space="preserve"> </w:t>
-      </w:r>
+        <w:t xml:space="preserve">The true negative rate, representing the proportion of healthy subjects correctly identified.</w:t>
+      </w:r>
+    </w:p>
+    <w:p>
+      <w:pPr>
+        <w:pStyle w:val="Compact"/>
+        <w:numPr>
+          <w:ilvl w:val="0"/>
+          <w:numId w:val="1007"/>
+        </w:numPr>
+      </w:pPr>
       <w:r>
         <w:rPr>
           <w:b/>
@@ -7042,59 +7036,39 @@
         <w:t xml:space="preserve"> </w:t>
       </w:r>
       <w:r>
-        <w:t xml:space="preserve">The harmonic mean of Precision</w:t>
-      </w:r>
-      <w:r>
-        <w:t xml:space="preserve"> </w:t>
-      </w:r>
-      <w:r>
-        <w:t xml:space="preserve">and Recall, providing a balanced performance measure under class</w:t>
-      </w:r>
-      <w:r>
-        <w:t xml:space="preserve"> </w:t>
-      </w:r>
-      <w:r>
-        <w:t xml:space="preserve">distribution uncertainty. *</w:t>
-      </w:r>
-      <w:r>
-        <w:t xml:space="preserve"> </w:t>
-      </w:r>
+        <w:t xml:space="preserve">The harmonic mean of Precision and Recall, providing a balanced performance measure under class distribution uncertainty.</w:t>
+      </w:r>
+    </w:p>
+    <w:p>
+      <w:pPr>
+        <w:pStyle w:val="Compact"/>
+        <w:numPr>
+          <w:ilvl w:val="0"/>
+          <w:numId w:val="1007"/>
+        </w:numPr>
+      </w:pPr>
       <w:r>
         <w:rPr>
           <w:b/>
           <w:bCs/>
         </w:rPr>
-        <w:t xml:space="preserve">Receiver Operating Characteristic Area</w:t>
-      </w:r>
-      <w:r>
-        <w:rPr>
-          <w:b/>
-          <w:bCs/>
-        </w:rPr>
-        <w:t xml:space="preserve"> </w:t>
-      </w:r>
-      <w:r>
-        <w:rPr>
-          <w:b/>
-          <w:bCs/>
-        </w:rPr>
-        <w:t xml:space="preserve">Under the Curve (ROC-AUC):</w:t>
-      </w:r>
-      <w:r>
-        <w:t xml:space="preserve"> </w:t>
-      </w:r>
-      <w:r>
-        <w:t xml:space="preserve">The overall discriminative capability</w:t>
-      </w:r>
-      <w:r>
-        <w:t xml:space="preserve"> </w:t>
-      </w:r>
-      <w:r>
-        <w:t xml:space="preserve">across all classification thresholds. *</w:t>
-      </w:r>
-      <w:r>
-        <w:t xml:space="preserve"> </w:t>
-      </w:r>
+        <w:t xml:space="preserve">Receiver Operating Characteristic Area Under the Curve (ROC-AUC):</w:t>
+      </w:r>
+      <w:r>
+        <w:t xml:space="preserve"> </w:t>
+      </w:r>
+      <w:r>
+        <w:t xml:space="preserve">The overall discriminative capability across all classification thresholds.</w:t>
+      </w:r>
+    </w:p>
+    <w:p>
+      <w:pPr>
+        <w:pStyle w:val="Compact"/>
+        <w:numPr>
+          <w:ilvl w:val="0"/>
+          <w:numId w:val="1007"/>
+        </w:numPr>
+      </w:pPr>
       <w:r>
         <w:rPr>
           <w:b/>
@@ -7106,24 +7080,12 @@
         <w:t xml:space="preserve"> </w:t>
       </w:r>
       <w:r>
-        <w:t xml:space="preserve">The</w:t>
-      </w:r>
-      <w:r>
-        <w:t xml:space="preserve"> </w:t>
-      </w:r>
-      <w:r>
-        <w:t xml:space="preserve">area under the Precision-Recall curve, representing the model’s positive</w:t>
-      </w:r>
-      <w:r>
-        <w:t xml:space="preserve"> </w:t>
-      </w:r>
-      <w:r>
-        <w:t xml:space="preserve">predictive value scaling across different recall levels.</w:t>
-      </w:r>
-    </w:p>
-    <w:p>
-      <w:pPr>
-        <w:pStyle w:val="BodyText"/>
+        <w:t xml:space="preserve">The area under the Precision-Recall curve, representing the model’s positive predictive value scaling across different recall levels.</w:t>
+      </w:r>
+    </w:p>
+    <w:p>
+      <w:pPr>
+        <w:pStyle w:val="FirstParagraph"/>
       </w:pPr>
       <w:r>
         <w:t xml:space="preserve">In screening contexts, Sensitivity and ROC-AUC are prioritized over</w:t>
@@ -7556,7 +7518,7 @@
       <w:pPr>
         <w:numPr>
           <w:ilvl w:val="0"/>
-          <w:numId w:val="1007"/>
+          <w:numId w:val="1008"/>
         </w:numPr>
       </w:pPr>
       <w:r>
@@ -7627,7 +7589,7 @@
       <w:pPr>
         <w:numPr>
           <w:ilvl w:val="0"/>
-          <w:numId w:val="1007"/>
+          <w:numId w:val="1008"/>
         </w:numPr>
       </w:pPr>
       <w:r>
@@ -7660,7 +7622,7 @@
       <w:pPr>
         <w:numPr>
           <w:ilvl w:val="0"/>
-          <w:numId w:val="1007"/>
+          <w:numId w:val="1008"/>
         </w:numPr>
       </w:pPr>
       <w:r>
@@ -7848,7 +7810,7 @@
       <w:pPr>
         <w:numPr>
           <w:ilvl w:val="0"/>
-          <w:numId w:val="1007"/>
+          <w:numId w:val="1008"/>
         </w:numPr>
       </w:pPr>
       <w:r>
@@ -9762,7 +9724,7 @@
       <w:pPr>
         <w:numPr>
           <w:ilvl w:val="0"/>
-          <w:numId w:val="1008"/>
+          <w:numId w:val="1009"/>
         </w:numPr>
       </w:pPr>
       <w:r>
@@ -9846,7 +9808,7 @@
       <w:pPr>
         <w:numPr>
           <w:ilvl w:val="0"/>
-          <w:numId w:val="1008"/>
+          <w:numId w:val="1009"/>
         </w:numPr>
       </w:pPr>
       <w:r>
@@ -9988,7 +9950,7 @@
       <w:pPr>
         <w:numPr>
           <w:ilvl w:val="0"/>
-          <w:numId w:val="1009"/>
+          <w:numId w:val="1010"/>
         </w:numPr>
       </w:pPr>
       <w:r>
@@ -10140,7 +10102,7 @@
       <w:pPr>
         <w:numPr>
           <w:ilvl w:val="0"/>
-          <w:numId w:val="1009"/>
+          <w:numId w:val="1010"/>
         </w:numPr>
       </w:pPr>
       <w:r>
@@ -10240,7 +10202,7 @@
       <w:pPr>
         <w:numPr>
           <w:ilvl w:val="0"/>
-          <w:numId w:val="1009"/>
+          <w:numId w:val="1010"/>
         </w:numPr>
       </w:pPr>
       <w:r>
@@ -10835,7 +10797,7 @@
       <w:pPr>
         <w:numPr>
           <w:ilvl w:val="0"/>
-          <w:numId w:val="1010"/>
+          <w:numId w:val="1011"/>
         </w:numPr>
       </w:pPr>
       <w:r>
@@ -10959,7 +10921,7 @@
       <w:pPr>
         <w:numPr>
           <w:ilvl w:val="0"/>
-          <w:numId w:val="1010"/>
+          <w:numId w:val="1011"/>
         </w:numPr>
       </w:pPr>
       <w:r>
@@ -11068,7 +11030,7 @@
       <w:pPr>
         <w:numPr>
           <w:ilvl w:val="0"/>
-          <w:numId w:val="1010"/>
+          <w:numId w:val="1011"/>
         </w:numPr>
       </w:pPr>
       <w:r>
@@ -12043,7 +12005,7 @@
       <w:pPr>
         <w:numPr>
           <w:ilvl w:val="0"/>
-          <w:numId w:val="1011"/>
+          <w:numId w:val="1012"/>
         </w:numPr>
       </w:pPr>
       <w:r>
@@ -12054,7 +12016,7 @@
       <w:pPr>
         <w:numPr>
           <w:ilvl w:val="0"/>
-          <w:numId w:val="1011"/>
+          <w:numId w:val="1012"/>
         </w:numPr>
       </w:pPr>
       <w:r>
@@ -12065,7 +12027,7 @@
       <w:pPr>
         <w:numPr>
           <w:ilvl w:val="0"/>
-          <w:numId w:val="1011"/>
+          <w:numId w:val="1012"/>
         </w:numPr>
       </w:pPr>
       <w:r>
@@ -12172,7 +12134,7 @@
       <w:pPr>
         <w:numPr>
           <w:ilvl w:val="0"/>
-          <w:numId w:val="1012"/>
+          <w:numId w:val="1013"/>
         </w:numPr>
       </w:pPr>
       <w:r>
@@ -12248,7 +12210,7 @@
       <w:pPr>
         <w:numPr>
           <w:ilvl w:val="0"/>
-          <w:numId w:val="1012"/>
+          <w:numId w:val="1013"/>
         </w:numPr>
       </w:pPr>
       <w:r>
@@ -15471,7 +15433,7 @@
       <w:pPr>
         <w:numPr>
           <w:ilvl w:val="0"/>
-          <w:numId w:val="1013"/>
+          <w:numId w:val="1014"/>
         </w:numPr>
       </w:pPr>
       <w:r>
@@ -15705,7 +15667,7 @@
       <w:pPr>
         <w:numPr>
           <w:ilvl w:val="0"/>
-          <w:numId w:val="1013"/>
+          <w:numId w:val="1014"/>
         </w:numPr>
       </w:pPr>
       <w:r>
@@ -15969,7 +15931,7 @@
       <w:pPr>
         <w:numPr>
           <w:ilvl w:val="0"/>
-          <w:numId w:val="1013"/>
+          <w:numId w:val="1014"/>
         </w:numPr>
       </w:pPr>
       <w:r>
@@ -16834,7 +16796,7 @@
       <w:pPr>
         <w:numPr>
           <w:ilvl w:val="0"/>
-          <w:numId w:val="1014"/>
+          <w:numId w:val="1015"/>
         </w:numPr>
       </w:pPr>
       <w:r>
@@ -16901,7 +16863,7 @@
       <w:pPr>
         <w:numPr>
           <w:ilvl w:val="0"/>
-          <w:numId w:val="1014"/>
+          <w:numId w:val="1015"/>
         </w:numPr>
       </w:pPr>
       <w:r>
@@ -16957,7 +16919,7 @@
       <w:pPr>
         <w:numPr>
           <w:ilvl w:val="0"/>
-          <w:numId w:val="1014"/>
+          <w:numId w:val="1015"/>
         </w:numPr>
       </w:pPr>
       <w:r>
@@ -17041,7 +17003,7 @@
       <w:pPr>
         <w:numPr>
           <w:ilvl w:val="0"/>
-          <w:numId w:val="1014"/>
+          <w:numId w:val="1015"/>
         </w:numPr>
       </w:pPr>
       <w:r>
@@ -17080,7 +17042,7 @@
       <w:pPr>
         <w:numPr>
           <w:ilvl w:val="0"/>
-          <w:numId w:val="1014"/>
+          <w:numId w:val="1015"/>
         </w:numPr>
       </w:pPr>
       <w:r>
@@ -17147,7 +17109,7 @@
       <w:pPr>
         <w:numPr>
           <w:ilvl w:val="0"/>
-          <w:numId w:val="1014"/>
+          <w:numId w:val="1015"/>
         </w:numPr>
       </w:pPr>
       <w:r>
@@ -17232,7 +17194,7 @@
       <w:pPr>
         <w:numPr>
           <w:ilvl w:val="0"/>
-          <w:numId w:val="1015"/>
+          <w:numId w:val="1016"/>
         </w:numPr>
       </w:pPr>
       <w:r>
@@ -17420,7 +17382,7 @@
       <w:pPr>
         <w:numPr>
           <w:ilvl w:val="0"/>
-          <w:numId w:val="1015"/>
+          <w:numId w:val="1016"/>
         </w:numPr>
       </w:pPr>
       <w:r>
@@ -17483,7 +17445,7 @@
       <w:pPr>
         <w:numPr>
           <w:ilvl w:val="0"/>
-          <w:numId w:val="1015"/>
+          <w:numId w:val="1016"/>
         </w:numPr>
       </w:pPr>
       <w:r>
@@ -17522,7 +17484,7 @@
       <w:pPr>
         <w:numPr>
           <w:ilvl w:val="0"/>
-          <w:numId w:val="1015"/>
+          <w:numId w:val="1016"/>
         </w:numPr>
       </w:pPr>
       <w:r>
@@ -17555,7 +17517,7 @@
       <w:pPr>
         <w:numPr>
           <w:ilvl w:val="0"/>
-          <w:numId w:val="1015"/>
+          <w:numId w:val="1016"/>
         </w:numPr>
       </w:pPr>
       <w:r>
@@ -19715,6 +19677,9 @@
     <w:abstractNumId w:val="991"/>
   </w:num>
   <w:num w:numId="1007">
+    <w:abstractNumId w:val="991"/>
+  </w:num>
+  <w:num w:numId="1008">
     <w:abstractNumId w:val="99411"/>
     <w:lvlOverride w:ilvl="0">
       <w:startOverride w:val="1"/>
@@ -19744,10 +19709,10 @@
       <w:startOverride w:val="1"/>
     </w:lvlOverride>
   </w:num>
-  <w:num w:numId="1008">
+  <w:num w:numId="1009">
     <w:abstractNumId w:val="991"/>
   </w:num>
-  <w:num w:numId="1009">
+  <w:num w:numId="1010">
     <w:abstractNumId w:val="99411"/>
     <w:lvlOverride w:ilvl="0">
       <w:startOverride w:val="1"/>
@@ -19777,9 +19742,6 @@
       <w:startOverride w:val="1"/>
     </w:lvlOverride>
   </w:num>
-  <w:num w:numId="1010">
-    <w:abstractNumId w:val="991"/>
-  </w:num>
   <w:num w:numId="1011">
     <w:abstractNumId w:val="991"/>
   </w:num>
@@ -19787,6 +19749,9 @@
     <w:abstractNumId w:val="991"/>
   </w:num>
   <w:num w:numId="1013">
+    <w:abstractNumId w:val="991"/>
+  </w:num>
+  <w:num w:numId="1014">
     <w:abstractNumId w:val="99412"/>
     <w:lvlOverride w:ilvl="0">
       <w:startOverride w:val="2"/>
@@ -19816,7 +19781,7 @@
       <w:startOverride w:val="2"/>
     </w:lvlOverride>
   </w:num>
-  <w:num w:numId="1014">
+  <w:num w:numId="1015">
     <w:abstractNumId w:val="99411"/>
     <w:lvlOverride w:ilvl="0">
       <w:startOverride w:val="1"/>
@@ -19846,7 +19811,7 @@
       <w:startOverride w:val="1"/>
     </w:lvlOverride>
   </w:num>
-  <w:num w:numId="1015">
+  <w:num w:numId="1016">
     <w:abstractNumId w:val="99411"/>
     <w:lvlOverride w:ilvl="0">
       <w:startOverride w:val="1"/>

</xml_diff>